<commit_message>
docs(files/java): add programs upto 5
</commit_message>
<xml_diff>
--- a/Practical Files/Java Programming Lab/Practical File.docx
+++ b/Practical Files/Java Programming Lab/Practical File.docx
@@ -952,14 +952,27 @@
                             <w:r>
                               <w:t xml:space="preserve">Figure </w:t>
                             </w:r>
-                            <w:fldSimple w:instr=" SEQ Figure \* ARABIC ">
-                              <w:r>
-                                <w:rPr>
-                                  <w:noProof/>
-                                </w:rPr>
-                                <w:t>1</w:t>
-                              </w:r>
-                            </w:fldSimple>
+                            <w:r>
+                              <w:fldChar w:fldCharType="begin"/>
+                            </w:r>
+                            <w:r>
+                              <w:instrText xml:space="preserve"> SEQ Figure \* ARABIC </w:instrText>
+                            </w:r>
+                            <w:r>
+                              <w:fldChar w:fldCharType="separate"/>
+                            </w:r>
+                            <w:r>
+                              <w:rPr>
+                                <w:noProof/>
+                              </w:rPr>
+                              <w:t>1</w:t>
+                            </w:r>
+                            <w:r>
+                              <w:rPr>
+                                <w:noProof/>
+                              </w:rPr>
+                              <w:fldChar w:fldCharType="end"/>
+                            </w:r>
                             <w:r>
                               <w:t>: Output of program 1</w:t>
                             </w:r>
@@ -999,14 +1012,27 @@
                       <w:r>
                         <w:t xml:space="preserve">Figure </w:t>
                       </w:r>
-                      <w:fldSimple w:instr=" SEQ Figure \* ARABIC ">
-                        <w:r>
-                          <w:rPr>
-                            <w:noProof/>
-                          </w:rPr>
-                          <w:t>1</w:t>
-                        </w:r>
-                      </w:fldSimple>
+                      <w:r>
+                        <w:fldChar w:fldCharType="begin"/>
+                      </w:r>
+                      <w:r>
+                        <w:instrText xml:space="preserve"> SEQ Figure \* ARABIC </w:instrText>
+                      </w:r>
+                      <w:r>
+                        <w:fldChar w:fldCharType="separate"/>
+                      </w:r>
+                      <w:r>
+                        <w:rPr>
+                          <w:noProof/>
+                        </w:rPr>
+                        <w:t>1</w:t>
+                      </w:r>
+                      <w:r>
+                        <w:rPr>
+                          <w:noProof/>
+                        </w:rPr>
+                        <w:fldChar w:fldCharType="end"/>
+                      </w:r>
                       <w:r>
                         <w:t>: Output of program 1</w:t>
                       </w:r>
@@ -1639,14 +1665,27 @@
                             <w:r>
                               <w:t xml:space="preserve">Figure </w:t>
                             </w:r>
-                            <w:fldSimple w:instr=" SEQ Figure \* ARABIC ">
-                              <w:r>
-                                <w:rPr>
-                                  <w:noProof/>
-                                </w:rPr>
-                                <w:t>2</w:t>
-                              </w:r>
-                            </w:fldSimple>
+                            <w:r>
+                              <w:fldChar w:fldCharType="begin"/>
+                            </w:r>
+                            <w:r>
+                              <w:instrText xml:space="preserve"> SEQ Figure \* ARABIC </w:instrText>
+                            </w:r>
+                            <w:r>
+                              <w:fldChar w:fldCharType="separate"/>
+                            </w:r>
+                            <w:r>
+                              <w:rPr>
+                                <w:noProof/>
+                              </w:rPr>
+                              <w:t>2</w:t>
+                            </w:r>
+                            <w:r>
+                              <w:rPr>
+                                <w:noProof/>
+                              </w:rPr>
+                              <w:fldChar w:fldCharType="end"/>
+                            </w:r>
                             <w:r>
                               <w:t>: Output of program 2</w:t>
                             </w:r>
@@ -1682,14 +1721,27 @@
                       <w:r>
                         <w:t xml:space="preserve">Figure </w:t>
                       </w:r>
-                      <w:fldSimple w:instr=" SEQ Figure \* ARABIC ">
-                        <w:r>
-                          <w:rPr>
-                            <w:noProof/>
-                          </w:rPr>
-                          <w:t>2</w:t>
-                        </w:r>
-                      </w:fldSimple>
+                      <w:r>
+                        <w:fldChar w:fldCharType="begin"/>
+                      </w:r>
+                      <w:r>
+                        <w:instrText xml:space="preserve"> SEQ Figure \* ARABIC </w:instrText>
+                      </w:r>
+                      <w:r>
+                        <w:fldChar w:fldCharType="separate"/>
+                      </w:r>
+                      <w:r>
+                        <w:rPr>
+                          <w:noProof/>
+                        </w:rPr>
+                        <w:t>2</w:t>
+                      </w:r>
+                      <w:r>
+                        <w:rPr>
+                          <w:noProof/>
+                        </w:rPr>
+                        <w:fldChar w:fldCharType="end"/>
+                      </w:r>
                       <w:r>
                         <w:t>: Output of program 2</w:t>
                       </w:r>
@@ -2338,14 +2390,27 @@
                             <w:r>
                               <w:t xml:space="preserve">Figure </w:t>
                             </w:r>
-                            <w:fldSimple w:instr=" SEQ Figure \* ARABIC ">
-                              <w:r>
-                                <w:rPr>
-                                  <w:noProof/>
-                                </w:rPr>
-                                <w:t>3</w:t>
-                              </w:r>
-                            </w:fldSimple>
+                            <w:r>
+                              <w:fldChar w:fldCharType="begin"/>
+                            </w:r>
+                            <w:r>
+                              <w:instrText xml:space="preserve"> SEQ Figure \* ARABIC </w:instrText>
+                            </w:r>
+                            <w:r>
+                              <w:fldChar w:fldCharType="separate"/>
+                            </w:r>
+                            <w:r>
+                              <w:rPr>
+                                <w:noProof/>
+                              </w:rPr>
+                              <w:t>3</w:t>
+                            </w:r>
+                            <w:r>
+                              <w:rPr>
+                                <w:noProof/>
+                              </w:rPr>
+                              <w:fldChar w:fldCharType="end"/>
+                            </w:r>
                             <w:r>
                               <w:t>: Output of program 3</w:t>
                             </w:r>
@@ -2382,14 +2447,27 @@
                       <w:r>
                         <w:t xml:space="preserve">Figure </w:t>
                       </w:r>
-                      <w:fldSimple w:instr=" SEQ Figure \* ARABIC ">
-                        <w:r>
-                          <w:rPr>
-                            <w:noProof/>
-                          </w:rPr>
-                          <w:t>3</w:t>
-                        </w:r>
-                      </w:fldSimple>
+                      <w:r>
+                        <w:fldChar w:fldCharType="begin"/>
+                      </w:r>
+                      <w:r>
+                        <w:instrText xml:space="preserve"> SEQ Figure \* ARABIC </w:instrText>
+                      </w:r>
+                      <w:r>
+                        <w:fldChar w:fldCharType="separate"/>
+                      </w:r>
+                      <w:r>
+                        <w:rPr>
+                          <w:noProof/>
+                        </w:rPr>
+                        <w:t>3</w:t>
+                      </w:r>
+                      <w:r>
+                        <w:rPr>
+                          <w:noProof/>
+                        </w:rPr>
+                        <w:fldChar w:fldCharType="end"/>
+                      </w:r>
                       <w:r>
                         <w:t>: Output of program 3</w:t>
                       </w:r>
@@ -3055,6 +3133,7 @@
         <w:rPr>
           <w:b/>
           <w:bCs/>
+          <w:noProof/>
           <w:lang w:val="en-US"/>
         </w:rPr>
         <w:drawing>
@@ -3190,14 +3269,27 @@
                             <w:r>
                               <w:t xml:space="preserve">Figure </w:t>
                             </w:r>
-                            <w:fldSimple w:instr=" SEQ Figure \* ARABIC ">
-                              <w:r>
-                                <w:rPr>
-                                  <w:noProof/>
-                                </w:rPr>
-                                <w:t>4</w:t>
-                              </w:r>
-                            </w:fldSimple>
+                            <w:r>
+                              <w:fldChar w:fldCharType="begin"/>
+                            </w:r>
+                            <w:r>
+                              <w:instrText xml:space="preserve"> SEQ Figure \* ARABIC </w:instrText>
+                            </w:r>
+                            <w:r>
+                              <w:fldChar w:fldCharType="separate"/>
+                            </w:r>
+                            <w:r>
+                              <w:rPr>
+                                <w:noProof/>
+                              </w:rPr>
+                              <w:t>4</w:t>
+                            </w:r>
+                            <w:r>
+                              <w:rPr>
+                                <w:noProof/>
+                              </w:rPr>
+                              <w:fldChar w:fldCharType="end"/>
+                            </w:r>
                             <w:r>
                               <w:t>: Output of program 4</w:t>
                             </w:r>
@@ -3234,14 +3326,27 @@
                       <w:r>
                         <w:t xml:space="preserve">Figure </w:t>
                       </w:r>
-                      <w:fldSimple w:instr=" SEQ Figure \* ARABIC ">
-                        <w:r>
-                          <w:rPr>
-                            <w:noProof/>
-                          </w:rPr>
-                          <w:t>4</w:t>
-                        </w:r>
-                      </w:fldSimple>
+                      <w:r>
+                        <w:fldChar w:fldCharType="begin"/>
+                      </w:r>
+                      <w:r>
+                        <w:instrText xml:space="preserve"> SEQ Figure \* ARABIC </w:instrText>
+                      </w:r>
+                      <w:r>
+                        <w:fldChar w:fldCharType="separate"/>
+                      </w:r>
+                      <w:r>
+                        <w:rPr>
+                          <w:noProof/>
+                        </w:rPr>
+                        <w:t>4</w:t>
+                      </w:r>
+                      <w:r>
+                        <w:rPr>
+                          <w:noProof/>
+                        </w:rPr>
+                        <w:fldChar w:fldCharType="end"/>
+                      </w:r>
                       <w:r>
                         <w:t>: Output of program 4</w:t>
                       </w:r>
@@ -3258,6 +3363,7 @@
         <w:rPr>
           <w:b/>
           <w:bCs/>
+          <w:noProof/>
           <w:lang w:val="en-US"/>
         </w:rPr>
         <w:drawing>
@@ -3358,9 +3464,3512 @@
         <w:t>*, % operations. Add a text field to display the result. Handle any possible exceptions like divided by zero.</w:t>
       </w:r>
     </w:p>
+    <w:p>
+      <w:pPr>
+        <w:pStyle w:val="NoSpacing"/>
+      </w:pPr>
+      <w:r>
+        <w:t xml:space="preserve">import </w:t>
+      </w:r>
+      <w:proofErr w:type="spellStart"/>
+      <w:proofErr w:type="gramStart"/>
+      <w:r>
+        <w:t>java.awt</w:t>
+      </w:r>
+      <w:proofErr w:type="spellEnd"/>
+      <w:r>
+        <w:t>.*</w:t>
+      </w:r>
+      <w:proofErr w:type="gramEnd"/>
+      <w:r>
+        <w:t>;</w:t>
+      </w:r>
+    </w:p>
+    <w:p>
+      <w:pPr>
+        <w:pStyle w:val="NoSpacing"/>
+      </w:pPr>
+      <w:r>
+        <w:t xml:space="preserve">import </w:t>
+      </w:r>
+      <w:proofErr w:type="spellStart"/>
+      <w:proofErr w:type="gramStart"/>
+      <w:r>
+        <w:t>java.awt.event</w:t>
+      </w:r>
+      <w:proofErr w:type="spellEnd"/>
+      <w:proofErr w:type="gramEnd"/>
+      <w:r>
+        <w:t>.*;</w:t>
+      </w:r>
+    </w:p>
+    <w:p>
+      <w:pPr>
+        <w:pStyle w:val="NoSpacing"/>
+      </w:pPr>
+      <w:r>
+        <w:t xml:space="preserve">import </w:t>
+      </w:r>
+      <w:proofErr w:type="spellStart"/>
+      <w:proofErr w:type="gramStart"/>
+      <w:r>
+        <w:t>javax.swing</w:t>
+      </w:r>
+      <w:proofErr w:type="gramEnd"/>
+      <w:r>
+        <w:t>.JOptionPane</w:t>
+      </w:r>
+      <w:proofErr w:type="spellEnd"/>
+      <w:r>
+        <w:t>;</w:t>
+      </w:r>
+    </w:p>
+    <w:p>
+      <w:pPr>
+        <w:pStyle w:val="NoSpacing"/>
+      </w:pPr>
+    </w:p>
+    <w:p>
+      <w:pPr>
+        <w:pStyle w:val="NoSpacing"/>
+      </w:pPr>
+      <w:r>
+        <w:t xml:space="preserve">public class Calculator implements </w:t>
+      </w:r>
+      <w:proofErr w:type="gramStart"/>
+      <w:r>
+        <w:t>ActionListener{</w:t>
+      </w:r>
+      <w:proofErr w:type="gramEnd"/>
+    </w:p>
+    <w:p>
+      <w:pPr>
+        <w:pStyle w:val="NoSpacing"/>
+      </w:pPr>
+      <w:r>
+        <w:t xml:space="preserve">    Frame </w:t>
+      </w:r>
+      <w:proofErr w:type="spellStart"/>
+      <w:r>
+        <w:t>frame</w:t>
+      </w:r>
+      <w:proofErr w:type="spellEnd"/>
+      <w:r>
+        <w:t>;</w:t>
+      </w:r>
+    </w:p>
+    <w:p>
+      <w:pPr>
+        <w:pStyle w:val="NoSpacing"/>
+      </w:pPr>
+      <w:r>
+        <w:t xml:space="preserve">    </w:t>
+      </w:r>
+      <w:proofErr w:type="spellStart"/>
+      <w:r>
+        <w:t>TextField</w:t>
+      </w:r>
+      <w:proofErr w:type="spellEnd"/>
+      <w:r>
+        <w:t xml:space="preserve"> display;</w:t>
+      </w:r>
+    </w:p>
+    <w:p>
+      <w:pPr>
+        <w:pStyle w:val="NoSpacing"/>
+      </w:pPr>
+      <w:r>
+        <w:t xml:space="preserve">    </w:t>
+      </w:r>
+      <w:proofErr w:type="gramStart"/>
+      <w:r>
+        <w:t>Button[</w:t>
+      </w:r>
+      <w:proofErr w:type="gramEnd"/>
+      <w:r>
+        <w:t xml:space="preserve">] </w:t>
+      </w:r>
+      <w:proofErr w:type="spellStart"/>
+      <w:r>
+        <w:t>digitButtons</w:t>
+      </w:r>
+      <w:proofErr w:type="spellEnd"/>
+      <w:r>
+        <w:t xml:space="preserve"> = new </w:t>
+      </w:r>
+      <w:proofErr w:type="gramStart"/>
+      <w:r>
+        <w:t>Button[</w:t>
+      </w:r>
+      <w:proofErr w:type="gramEnd"/>
+      <w:r>
+        <w:t>10];</w:t>
+      </w:r>
+    </w:p>
+    <w:p>
+      <w:pPr>
+        <w:pStyle w:val="NoSpacing"/>
+      </w:pPr>
+      <w:r>
+        <w:t xml:space="preserve">    Button add, subtract, multiply, divide, clear, modulo, </w:t>
+      </w:r>
+      <w:proofErr w:type="spellStart"/>
+      <w:r>
+        <w:t>equalTo</w:t>
+      </w:r>
+      <w:proofErr w:type="spellEnd"/>
+      <w:r>
+        <w:t>;</w:t>
+      </w:r>
+    </w:p>
+    <w:p>
+      <w:pPr>
+        <w:pStyle w:val="NoSpacing"/>
+      </w:pPr>
+      <w:r>
+        <w:t>    double num1, num2, result;</w:t>
+      </w:r>
+    </w:p>
+    <w:p>
+      <w:pPr>
+        <w:pStyle w:val="NoSpacing"/>
+      </w:pPr>
+      <w:r>
+        <w:t>    char operator;</w:t>
+      </w:r>
+    </w:p>
+    <w:p>
+      <w:pPr>
+        <w:pStyle w:val="NoSpacing"/>
+      </w:pPr>
+      <w:r>
+        <w:t xml:space="preserve">    </w:t>
+      </w:r>
+      <w:proofErr w:type="spellStart"/>
+      <w:r>
+        <w:t>boolean</w:t>
+      </w:r>
+      <w:proofErr w:type="spellEnd"/>
+      <w:r>
+        <w:t xml:space="preserve"> </w:t>
+      </w:r>
+      <w:proofErr w:type="spellStart"/>
+      <w:r>
+        <w:t>calculationDone</w:t>
+      </w:r>
+      <w:proofErr w:type="spellEnd"/>
+      <w:r>
+        <w:t xml:space="preserve"> = false;</w:t>
+      </w:r>
+    </w:p>
+    <w:p>
+      <w:pPr>
+        <w:pStyle w:val="NoSpacing"/>
+      </w:pPr>
+    </w:p>
+    <w:p>
+      <w:pPr>
+        <w:pStyle w:val="NoSpacing"/>
+      </w:pPr>
+      <w:r>
+        <w:t xml:space="preserve">    public </w:t>
+      </w:r>
+      <w:proofErr w:type="gramStart"/>
+      <w:r>
+        <w:t>Calculator(</w:t>
+      </w:r>
+      <w:proofErr w:type="gramEnd"/>
+      <w:r>
+        <w:t>) {</w:t>
+      </w:r>
+    </w:p>
+    <w:p>
+      <w:pPr>
+        <w:pStyle w:val="NoSpacing"/>
+      </w:pPr>
+      <w:r>
+        <w:t>        frame = new Frame("Calculator");</w:t>
+      </w:r>
+    </w:p>
+    <w:p>
+      <w:pPr>
+        <w:pStyle w:val="NoSpacing"/>
+      </w:pPr>
+      <w:r>
+        <w:t xml:space="preserve">        </w:t>
+      </w:r>
+      <w:proofErr w:type="spellStart"/>
+      <w:proofErr w:type="gramStart"/>
+      <w:r>
+        <w:t>frame.addWindowListener</w:t>
+      </w:r>
+      <w:proofErr w:type="spellEnd"/>
+      <w:proofErr w:type="gramEnd"/>
+      <w:r>
+        <w:t xml:space="preserve">(new </w:t>
+      </w:r>
+      <w:proofErr w:type="spellStart"/>
+      <w:proofErr w:type="gramStart"/>
+      <w:r>
+        <w:t>WindowAdapter</w:t>
+      </w:r>
+      <w:proofErr w:type="spellEnd"/>
+      <w:r>
+        <w:t>(</w:t>
+      </w:r>
+      <w:proofErr w:type="gramEnd"/>
+      <w:r>
+        <w:t>) {</w:t>
+      </w:r>
+    </w:p>
+    <w:p>
+      <w:pPr>
+        <w:pStyle w:val="NoSpacing"/>
+      </w:pPr>
+      <w:r>
+        <w:t>            @Override</w:t>
+      </w:r>
+    </w:p>
+    <w:p>
+      <w:pPr>
+        <w:pStyle w:val="NoSpacing"/>
+      </w:pPr>
+      <w:r>
+        <w:t xml:space="preserve">            public void </w:t>
+      </w:r>
+      <w:proofErr w:type="spellStart"/>
+      <w:proofErr w:type="gramStart"/>
+      <w:r>
+        <w:t>windowClosing</w:t>
+      </w:r>
+      <w:proofErr w:type="spellEnd"/>
+      <w:r>
+        <w:t>(</w:t>
+      </w:r>
+      <w:proofErr w:type="spellStart"/>
+      <w:proofErr w:type="gramEnd"/>
+      <w:r>
+        <w:t>WindowEvent</w:t>
+      </w:r>
+      <w:proofErr w:type="spellEnd"/>
+      <w:r>
+        <w:t xml:space="preserve"> e) {</w:t>
+      </w:r>
+    </w:p>
+    <w:p>
+      <w:pPr>
+        <w:pStyle w:val="NoSpacing"/>
+      </w:pPr>
+      <w:r>
+        <w:t xml:space="preserve">                </w:t>
+      </w:r>
+      <w:proofErr w:type="spellStart"/>
+      <w:proofErr w:type="gramStart"/>
+      <w:r>
+        <w:t>frame.dispose</w:t>
+      </w:r>
+      <w:proofErr w:type="spellEnd"/>
+      <w:proofErr w:type="gramEnd"/>
+      <w:r>
+        <w:t>();</w:t>
+      </w:r>
+    </w:p>
+    <w:p>
+      <w:pPr>
+        <w:pStyle w:val="NoSpacing"/>
+      </w:pPr>
+      <w:r>
+        <w:t xml:space="preserve">                </w:t>
+      </w:r>
+      <w:proofErr w:type="spellStart"/>
+      <w:r>
+        <w:t>System.exit</w:t>
+      </w:r>
+      <w:proofErr w:type="spellEnd"/>
+      <w:r>
+        <w:t>(0);</w:t>
+      </w:r>
+    </w:p>
+    <w:p>
+      <w:pPr>
+        <w:pStyle w:val="NoSpacing"/>
+      </w:pPr>
+      <w:r>
+        <w:t>            }</w:t>
+      </w:r>
+    </w:p>
+    <w:p>
+      <w:pPr>
+        <w:pStyle w:val="NoSpacing"/>
+      </w:pPr>
+      <w:r>
+        <w:t>        });</w:t>
+      </w:r>
+    </w:p>
+    <w:p>
+      <w:pPr>
+        <w:pStyle w:val="NoSpacing"/>
+      </w:pPr>
+    </w:p>
+    <w:p>
+      <w:pPr>
+        <w:pStyle w:val="NoSpacing"/>
+      </w:pPr>
+      <w:r>
+        <w:t xml:space="preserve">        display = new </w:t>
+      </w:r>
+      <w:proofErr w:type="spellStart"/>
+      <w:proofErr w:type="gramStart"/>
+      <w:r>
+        <w:t>TextField</w:t>
+      </w:r>
+      <w:proofErr w:type="spellEnd"/>
+      <w:r>
+        <w:t>(</w:t>
+      </w:r>
+      <w:proofErr w:type="gramEnd"/>
+      <w:r>
+        <w:t>);</w:t>
+      </w:r>
+    </w:p>
+    <w:p>
+      <w:pPr>
+        <w:pStyle w:val="NoSpacing"/>
+      </w:pPr>
+      <w:r>
+        <w:t xml:space="preserve">        </w:t>
+      </w:r>
+      <w:proofErr w:type="spellStart"/>
+      <w:proofErr w:type="gramStart"/>
+      <w:r>
+        <w:t>display.setEditable</w:t>
+      </w:r>
+      <w:proofErr w:type="spellEnd"/>
+      <w:proofErr w:type="gramEnd"/>
+      <w:r>
+        <w:t>(false);</w:t>
+      </w:r>
+    </w:p>
+    <w:p>
+      <w:pPr>
+        <w:pStyle w:val="NoSpacing"/>
+      </w:pPr>
+      <w:r>
+        <w:t xml:space="preserve">        </w:t>
+      </w:r>
+      <w:proofErr w:type="spellStart"/>
+      <w:proofErr w:type="gramStart"/>
+      <w:r>
+        <w:t>display.setFont</w:t>
+      </w:r>
+      <w:proofErr w:type="spellEnd"/>
+      <w:proofErr w:type="gramEnd"/>
+      <w:r>
+        <w:t xml:space="preserve">(new </w:t>
+      </w:r>
+      <w:proofErr w:type="gramStart"/>
+      <w:r>
+        <w:t>Font(</w:t>
+      </w:r>
+      <w:proofErr w:type="gramEnd"/>
+      <w:r>
+        <w:t xml:space="preserve">"Arial", </w:t>
+      </w:r>
+      <w:proofErr w:type="spellStart"/>
+      <w:r>
+        <w:t>Font.BOLD</w:t>
+      </w:r>
+      <w:proofErr w:type="spellEnd"/>
+      <w:r>
+        <w:t>, 25));</w:t>
+      </w:r>
+    </w:p>
+    <w:p>
+      <w:pPr>
+        <w:pStyle w:val="NoSpacing"/>
+      </w:pPr>
+      <w:r>
+        <w:t xml:space="preserve">        </w:t>
+      </w:r>
+      <w:proofErr w:type="spellStart"/>
+      <w:proofErr w:type="gramStart"/>
+      <w:r>
+        <w:t>frame.add</w:t>
+      </w:r>
+      <w:proofErr w:type="spellEnd"/>
+      <w:r>
+        <w:t>(</w:t>
+      </w:r>
+      <w:proofErr w:type="gramEnd"/>
+      <w:r>
+        <w:t xml:space="preserve">display, </w:t>
+      </w:r>
+      <w:proofErr w:type="spellStart"/>
+      <w:r>
+        <w:t>BorderLayout.NORTH</w:t>
+      </w:r>
+      <w:proofErr w:type="spellEnd"/>
+      <w:r>
+        <w:t>);</w:t>
+      </w:r>
+    </w:p>
+    <w:p>
+      <w:pPr>
+        <w:pStyle w:val="NoSpacing"/>
+      </w:pPr>
+    </w:p>
+    <w:p>
+      <w:pPr>
+        <w:pStyle w:val="NoSpacing"/>
+      </w:pPr>
+      <w:r>
+        <w:t xml:space="preserve">        Panel </w:t>
+      </w:r>
+      <w:proofErr w:type="spellStart"/>
+      <w:r>
+        <w:t>panel</w:t>
+      </w:r>
+      <w:proofErr w:type="spellEnd"/>
+      <w:r>
+        <w:t xml:space="preserve"> = new </w:t>
+      </w:r>
+      <w:proofErr w:type="gramStart"/>
+      <w:r>
+        <w:t>Panel(</w:t>
+      </w:r>
+      <w:proofErr w:type="gramEnd"/>
+      <w:r>
+        <w:t>);</w:t>
+      </w:r>
+    </w:p>
+    <w:p>
+      <w:pPr>
+        <w:pStyle w:val="NoSpacing"/>
+      </w:pPr>
+      <w:r>
+        <w:t xml:space="preserve">        </w:t>
+      </w:r>
+      <w:proofErr w:type="spellStart"/>
+      <w:proofErr w:type="gramStart"/>
+      <w:r>
+        <w:t>panel.setLayout</w:t>
+      </w:r>
+      <w:proofErr w:type="spellEnd"/>
+      <w:proofErr w:type="gramEnd"/>
+      <w:r>
+        <w:t xml:space="preserve">(new </w:t>
+      </w:r>
+      <w:proofErr w:type="spellStart"/>
+      <w:proofErr w:type="gramStart"/>
+      <w:r>
+        <w:t>GridLayout</w:t>
+      </w:r>
+      <w:proofErr w:type="spellEnd"/>
+      <w:r>
+        <w:t>(</w:t>
+      </w:r>
+      <w:proofErr w:type="gramEnd"/>
+      <w:r>
+        <w:t>4, 4));</w:t>
+      </w:r>
+    </w:p>
+    <w:p>
+      <w:pPr>
+        <w:pStyle w:val="NoSpacing"/>
+      </w:pPr>
+      <w:r>
+        <w:t xml:space="preserve">        for (int </w:t>
+      </w:r>
+      <w:proofErr w:type="spellStart"/>
+      <w:r>
+        <w:t>i</w:t>
+      </w:r>
+      <w:proofErr w:type="spellEnd"/>
+      <w:r>
+        <w:t xml:space="preserve"> = 0; </w:t>
+      </w:r>
+      <w:proofErr w:type="spellStart"/>
+      <w:r>
+        <w:t>i</w:t>
+      </w:r>
+      <w:proofErr w:type="spellEnd"/>
+      <w:r>
+        <w:t xml:space="preserve"> &lt;= 9; </w:t>
+      </w:r>
+      <w:proofErr w:type="spellStart"/>
+      <w:r>
+        <w:t>i</w:t>
+      </w:r>
+      <w:proofErr w:type="spellEnd"/>
+      <w:r>
+        <w:t>++) {</w:t>
+      </w:r>
+    </w:p>
+    <w:p>
+      <w:pPr>
+        <w:pStyle w:val="NoSpacing"/>
+      </w:pPr>
+      <w:r>
+        <w:t xml:space="preserve">            </w:t>
+      </w:r>
+      <w:proofErr w:type="spellStart"/>
+      <w:r>
+        <w:t>digitButtons</w:t>
+      </w:r>
+      <w:proofErr w:type="spellEnd"/>
+      <w:r>
+        <w:t>[</w:t>
+      </w:r>
+      <w:proofErr w:type="spellStart"/>
+      <w:r>
+        <w:t>i</w:t>
+      </w:r>
+      <w:proofErr w:type="spellEnd"/>
+      <w:r>
+        <w:t xml:space="preserve">] = new </w:t>
+      </w:r>
+      <w:proofErr w:type="gramStart"/>
+      <w:r>
+        <w:t>Button(</w:t>
+      </w:r>
+      <w:proofErr w:type="spellStart"/>
+      <w:proofErr w:type="gramEnd"/>
+      <w:r>
+        <w:t>String.valueOf</w:t>
+      </w:r>
+      <w:proofErr w:type="spellEnd"/>
+      <w:r>
+        <w:t>(</w:t>
+      </w:r>
+      <w:proofErr w:type="spellStart"/>
+      <w:r>
+        <w:t>i</w:t>
+      </w:r>
+      <w:proofErr w:type="spellEnd"/>
+      <w:r>
+        <w:t>));</w:t>
+      </w:r>
+    </w:p>
+    <w:p>
+      <w:pPr>
+        <w:pStyle w:val="NoSpacing"/>
+      </w:pPr>
+      <w:r>
+        <w:t xml:space="preserve">            </w:t>
+      </w:r>
+      <w:proofErr w:type="spellStart"/>
+      <w:r>
+        <w:t>digitButtons</w:t>
+      </w:r>
+      <w:proofErr w:type="spellEnd"/>
+      <w:r>
+        <w:t>[</w:t>
+      </w:r>
+      <w:proofErr w:type="spellStart"/>
+      <w:r>
+        <w:t>i</w:t>
+      </w:r>
+      <w:proofErr w:type="spellEnd"/>
+      <w:proofErr w:type="gramStart"/>
+      <w:r>
+        <w:t>].</w:t>
+      </w:r>
+      <w:proofErr w:type="spellStart"/>
+      <w:r>
+        <w:t>addActionListener</w:t>
+      </w:r>
+      <w:proofErr w:type="spellEnd"/>
+      <w:proofErr w:type="gramEnd"/>
+      <w:r>
+        <w:t>(this);</w:t>
+      </w:r>
+    </w:p>
+    <w:p>
+      <w:pPr>
+        <w:pStyle w:val="NoSpacing"/>
+      </w:pPr>
+      <w:r>
+        <w:t>        }</w:t>
+      </w:r>
+    </w:p>
+    <w:p>
+      <w:pPr>
+        <w:pStyle w:val="NoSpacing"/>
+      </w:pPr>
+    </w:p>
+    <w:p>
+      <w:pPr>
+        <w:pStyle w:val="NoSpacing"/>
+      </w:pPr>
+      <w:r>
+        <w:t xml:space="preserve">        add = new </w:t>
+      </w:r>
+      <w:proofErr w:type="gramStart"/>
+      <w:r>
+        <w:t>Button(</w:t>
+      </w:r>
+      <w:proofErr w:type="gramEnd"/>
+      <w:r>
+        <w:t>"+");</w:t>
+      </w:r>
+    </w:p>
+    <w:p>
+      <w:pPr>
+        <w:pStyle w:val="NoSpacing"/>
+      </w:pPr>
+      <w:r>
+        <w:t xml:space="preserve">        subtract = new </w:t>
+      </w:r>
+      <w:proofErr w:type="gramStart"/>
+      <w:r>
+        <w:t>Button(</w:t>
+      </w:r>
+      <w:proofErr w:type="gramEnd"/>
+      <w:r>
+        <w:t>"-");</w:t>
+      </w:r>
+    </w:p>
+    <w:p>
+      <w:pPr>
+        <w:pStyle w:val="NoSpacing"/>
+      </w:pPr>
+      <w:r>
+        <w:t xml:space="preserve">        multiply = new </w:t>
+      </w:r>
+      <w:proofErr w:type="gramStart"/>
+      <w:r>
+        <w:t>Button(</w:t>
+      </w:r>
+      <w:proofErr w:type="gramEnd"/>
+      <w:r>
+        <w:t>"*");</w:t>
+      </w:r>
+    </w:p>
+    <w:p>
+      <w:pPr>
+        <w:pStyle w:val="NoSpacing"/>
+      </w:pPr>
+      <w:r>
+        <w:t xml:space="preserve">        divide = new </w:t>
+      </w:r>
+      <w:proofErr w:type="gramStart"/>
+      <w:r>
+        <w:t>Button(</w:t>
+      </w:r>
+      <w:proofErr w:type="gramEnd"/>
+      <w:r>
+        <w:t>"/");</w:t>
+      </w:r>
+    </w:p>
+    <w:p>
+      <w:pPr>
+        <w:pStyle w:val="NoSpacing"/>
+      </w:pPr>
+      <w:r>
+        <w:t xml:space="preserve">        modulo = new </w:t>
+      </w:r>
+      <w:proofErr w:type="gramStart"/>
+      <w:r>
+        <w:t>Button(</w:t>
+      </w:r>
+      <w:proofErr w:type="gramEnd"/>
+      <w:r>
+        <w:t>"%");</w:t>
+      </w:r>
+    </w:p>
+    <w:p>
+      <w:pPr>
+        <w:pStyle w:val="NoSpacing"/>
+      </w:pPr>
+      <w:r>
+        <w:t xml:space="preserve">        </w:t>
+      </w:r>
+      <w:proofErr w:type="spellStart"/>
+      <w:r>
+        <w:t>equalTo</w:t>
+      </w:r>
+      <w:proofErr w:type="spellEnd"/>
+      <w:r>
+        <w:t xml:space="preserve"> = new </w:t>
+      </w:r>
+      <w:proofErr w:type="gramStart"/>
+      <w:r>
+        <w:t>Button(</w:t>
+      </w:r>
+      <w:proofErr w:type="gramEnd"/>
+      <w:r>
+        <w:t>"=");</w:t>
+      </w:r>
+    </w:p>
+    <w:p>
+      <w:pPr>
+        <w:pStyle w:val="NoSpacing"/>
+      </w:pPr>
+      <w:r>
+        <w:t>        clear = new Button("C");</w:t>
+      </w:r>
+    </w:p>
+    <w:p>
+      <w:pPr>
+        <w:pStyle w:val="NoSpacing"/>
+      </w:pPr>
+    </w:p>
+    <w:p>
+      <w:pPr>
+        <w:pStyle w:val="NoSpacing"/>
+      </w:pPr>
+      <w:r>
+        <w:t xml:space="preserve">        </w:t>
+      </w:r>
+      <w:proofErr w:type="spellStart"/>
+      <w:proofErr w:type="gramStart"/>
+      <w:r>
+        <w:t>add.addActionListener</w:t>
+      </w:r>
+      <w:proofErr w:type="spellEnd"/>
+      <w:proofErr w:type="gramEnd"/>
+      <w:r>
+        <w:t>(this);</w:t>
+      </w:r>
+    </w:p>
+    <w:p>
+      <w:pPr>
+        <w:pStyle w:val="NoSpacing"/>
+      </w:pPr>
+      <w:r>
+        <w:lastRenderedPageBreak/>
+        <w:t xml:space="preserve">        </w:t>
+      </w:r>
+      <w:proofErr w:type="spellStart"/>
+      <w:proofErr w:type="gramStart"/>
+      <w:r>
+        <w:t>subtract.addActionListener</w:t>
+      </w:r>
+      <w:proofErr w:type="spellEnd"/>
+      <w:proofErr w:type="gramEnd"/>
+      <w:r>
+        <w:t>(this);</w:t>
+      </w:r>
+    </w:p>
+    <w:p>
+      <w:pPr>
+        <w:pStyle w:val="NoSpacing"/>
+      </w:pPr>
+      <w:r>
+        <w:t xml:space="preserve">        </w:t>
+      </w:r>
+      <w:proofErr w:type="spellStart"/>
+      <w:proofErr w:type="gramStart"/>
+      <w:r>
+        <w:t>multiply.addActionListener</w:t>
+      </w:r>
+      <w:proofErr w:type="spellEnd"/>
+      <w:proofErr w:type="gramEnd"/>
+      <w:r>
+        <w:t>(this);</w:t>
+      </w:r>
+    </w:p>
+    <w:p>
+      <w:pPr>
+        <w:pStyle w:val="NoSpacing"/>
+      </w:pPr>
+      <w:r>
+        <w:t xml:space="preserve">        </w:t>
+      </w:r>
+      <w:proofErr w:type="spellStart"/>
+      <w:proofErr w:type="gramStart"/>
+      <w:r>
+        <w:t>divide.addActionListener</w:t>
+      </w:r>
+      <w:proofErr w:type="spellEnd"/>
+      <w:proofErr w:type="gramEnd"/>
+      <w:r>
+        <w:t>(this);</w:t>
+      </w:r>
+    </w:p>
+    <w:p>
+      <w:pPr>
+        <w:pStyle w:val="NoSpacing"/>
+      </w:pPr>
+      <w:r>
+        <w:t xml:space="preserve">        </w:t>
+      </w:r>
+      <w:proofErr w:type="spellStart"/>
+      <w:proofErr w:type="gramStart"/>
+      <w:r>
+        <w:t>modulo.addActionListener</w:t>
+      </w:r>
+      <w:proofErr w:type="spellEnd"/>
+      <w:proofErr w:type="gramEnd"/>
+      <w:r>
+        <w:t>(this);</w:t>
+      </w:r>
+    </w:p>
+    <w:p>
+      <w:pPr>
+        <w:pStyle w:val="NoSpacing"/>
+      </w:pPr>
+      <w:r>
+        <w:t xml:space="preserve">        </w:t>
+      </w:r>
+      <w:proofErr w:type="spellStart"/>
+      <w:r>
+        <w:t>equalTo.addActionListener</w:t>
+      </w:r>
+      <w:proofErr w:type="spellEnd"/>
+      <w:r>
+        <w:t>(this);</w:t>
+      </w:r>
+    </w:p>
+    <w:p>
+      <w:pPr>
+        <w:pStyle w:val="NoSpacing"/>
+      </w:pPr>
+      <w:r>
+        <w:t xml:space="preserve">        </w:t>
+      </w:r>
+      <w:proofErr w:type="spellStart"/>
+      <w:proofErr w:type="gramStart"/>
+      <w:r>
+        <w:t>clear.addActionListener</w:t>
+      </w:r>
+      <w:proofErr w:type="spellEnd"/>
+      <w:proofErr w:type="gramEnd"/>
+      <w:r>
+        <w:t>(this);</w:t>
+      </w:r>
+    </w:p>
+    <w:p>
+      <w:pPr>
+        <w:pStyle w:val="NoSpacing"/>
+      </w:pPr>
+    </w:p>
+    <w:p>
+      <w:pPr>
+        <w:pStyle w:val="NoSpacing"/>
+      </w:pPr>
+      <w:r>
+        <w:t xml:space="preserve">        </w:t>
+      </w:r>
+      <w:proofErr w:type="spellStart"/>
+      <w:r>
+        <w:t>panel.add</w:t>
+      </w:r>
+      <w:proofErr w:type="spellEnd"/>
+      <w:r>
+        <w:t>(</w:t>
+      </w:r>
+      <w:proofErr w:type="spellStart"/>
+      <w:proofErr w:type="gramStart"/>
+      <w:r>
+        <w:t>digitButtons</w:t>
+      </w:r>
+      <w:proofErr w:type="spellEnd"/>
+      <w:r>
+        <w:t>[</w:t>
+      </w:r>
+      <w:proofErr w:type="gramEnd"/>
+      <w:r>
+        <w:t>7]);</w:t>
+      </w:r>
+    </w:p>
+    <w:p>
+      <w:pPr>
+        <w:pStyle w:val="NoSpacing"/>
+      </w:pPr>
+      <w:r>
+        <w:t xml:space="preserve">        </w:t>
+      </w:r>
+      <w:proofErr w:type="spellStart"/>
+      <w:r>
+        <w:t>panel.add</w:t>
+      </w:r>
+      <w:proofErr w:type="spellEnd"/>
+      <w:r>
+        <w:t>(</w:t>
+      </w:r>
+      <w:proofErr w:type="spellStart"/>
+      <w:proofErr w:type="gramStart"/>
+      <w:r>
+        <w:t>digitButtons</w:t>
+      </w:r>
+      <w:proofErr w:type="spellEnd"/>
+      <w:r>
+        <w:t>[</w:t>
+      </w:r>
+      <w:proofErr w:type="gramEnd"/>
+      <w:r>
+        <w:t>8]);</w:t>
+      </w:r>
+    </w:p>
+    <w:p>
+      <w:pPr>
+        <w:pStyle w:val="NoSpacing"/>
+      </w:pPr>
+      <w:r>
+        <w:t xml:space="preserve">        </w:t>
+      </w:r>
+      <w:proofErr w:type="spellStart"/>
+      <w:r>
+        <w:t>panel.add</w:t>
+      </w:r>
+      <w:proofErr w:type="spellEnd"/>
+      <w:r>
+        <w:t>(</w:t>
+      </w:r>
+      <w:proofErr w:type="spellStart"/>
+      <w:proofErr w:type="gramStart"/>
+      <w:r>
+        <w:t>digitButtons</w:t>
+      </w:r>
+      <w:proofErr w:type="spellEnd"/>
+      <w:r>
+        <w:t>[</w:t>
+      </w:r>
+      <w:proofErr w:type="gramEnd"/>
+      <w:r>
+        <w:t>9]);</w:t>
+      </w:r>
+    </w:p>
+    <w:p>
+      <w:pPr>
+        <w:pStyle w:val="NoSpacing"/>
+      </w:pPr>
+      <w:r>
+        <w:t xml:space="preserve">        </w:t>
+      </w:r>
+      <w:proofErr w:type="spellStart"/>
+      <w:r>
+        <w:t>panel.add</w:t>
+      </w:r>
+      <w:proofErr w:type="spellEnd"/>
+      <w:r>
+        <w:t>(divide);</w:t>
+      </w:r>
+    </w:p>
+    <w:p>
+      <w:pPr>
+        <w:pStyle w:val="NoSpacing"/>
+      </w:pPr>
+    </w:p>
+    <w:p>
+      <w:pPr>
+        <w:pStyle w:val="NoSpacing"/>
+      </w:pPr>
+      <w:r>
+        <w:t xml:space="preserve">        </w:t>
+      </w:r>
+      <w:proofErr w:type="spellStart"/>
+      <w:r>
+        <w:t>panel.add</w:t>
+      </w:r>
+      <w:proofErr w:type="spellEnd"/>
+      <w:r>
+        <w:t>(</w:t>
+      </w:r>
+      <w:proofErr w:type="spellStart"/>
+      <w:proofErr w:type="gramStart"/>
+      <w:r>
+        <w:t>digitButtons</w:t>
+      </w:r>
+      <w:proofErr w:type="spellEnd"/>
+      <w:r>
+        <w:t>[</w:t>
+      </w:r>
+      <w:proofErr w:type="gramEnd"/>
+      <w:r>
+        <w:t>4]);</w:t>
+      </w:r>
+    </w:p>
+    <w:p>
+      <w:pPr>
+        <w:pStyle w:val="NoSpacing"/>
+      </w:pPr>
+      <w:r>
+        <w:t xml:space="preserve">        </w:t>
+      </w:r>
+      <w:proofErr w:type="spellStart"/>
+      <w:r>
+        <w:t>panel.add</w:t>
+      </w:r>
+      <w:proofErr w:type="spellEnd"/>
+      <w:r>
+        <w:t>(</w:t>
+      </w:r>
+      <w:proofErr w:type="spellStart"/>
+      <w:proofErr w:type="gramStart"/>
+      <w:r>
+        <w:t>digitButtons</w:t>
+      </w:r>
+      <w:proofErr w:type="spellEnd"/>
+      <w:r>
+        <w:t>[</w:t>
+      </w:r>
+      <w:proofErr w:type="gramEnd"/>
+      <w:r>
+        <w:t>5]);</w:t>
+      </w:r>
+    </w:p>
+    <w:p>
+      <w:pPr>
+        <w:pStyle w:val="NoSpacing"/>
+      </w:pPr>
+      <w:r>
+        <w:t xml:space="preserve">        </w:t>
+      </w:r>
+      <w:proofErr w:type="spellStart"/>
+      <w:r>
+        <w:t>panel.add</w:t>
+      </w:r>
+      <w:proofErr w:type="spellEnd"/>
+      <w:r>
+        <w:t>(</w:t>
+      </w:r>
+      <w:proofErr w:type="spellStart"/>
+      <w:proofErr w:type="gramStart"/>
+      <w:r>
+        <w:t>digitButtons</w:t>
+      </w:r>
+      <w:proofErr w:type="spellEnd"/>
+      <w:r>
+        <w:t>[</w:t>
+      </w:r>
+      <w:proofErr w:type="gramEnd"/>
+      <w:r>
+        <w:t>6]);</w:t>
+      </w:r>
+    </w:p>
+    <w:p>
+      <w:pPr>
+        <w:pStyle w:val="NoSpacing"/>
+      </w:pPr>
+      <w:r>
+        <w:t xml:space="preserve">        </w:t>
+      </w:r>
+      <w:proofErr w:type="spellStart"/>
+      <w:r>
+        <w:t>panel.add</w:t>
+      </w:r>
+      <w:proofErr w:type="spellEnd"/>
+      <w:r>
+        <w:t>(multiply);</w:t>
+      </w:r>
+    </w:p>
+    <w:p>
+      <w:pPr>
+        <w:pStyle w:val="NoSpacing"/>
+      </w:pPr>
+    </w:p>
+    <w:p>
+      <w:pPr>
+        <w:pStyle w:val="NoSpacing"/>
+      </w:pPr>
+      <w:r>
+        <w:t xml:space="preserve">        </w:t>
+      </w:r>
+      <w:proofErr w:type="spellStart"/>
+      <w:r>
+        <w:t>panel.add</w:t>
+      </w:r>
+      <w:proofErr w:type="spellEnd"/>
+      <w:r>
+        <w:t>(</w:t>
+      </w:r>
+      <w:proofErr w:type="spellStart"/>
+      <w:proofErr w:type="gramStart"/>
+      <w:r>
+        <w:t>digitButtons</w:t>
+      </w:r>
+      <w:proofErr w:type="spellEnd"/>
+      <w:r>
+        <w:t>[</w:t>
+      </w:r>
+      <w:proofErr w:type="gramEnd"/>
+      <w:r>
+        <w:t>1]);</w:t>
+      </w:r>
+    </w:p>
+    <w:p>
+      <w:pPr>
+        <w:pStyle w:val="NoSpacing"/>
+      </w:pPr>
+      <w:r>
+        <w:t xml:space="preserve">        </w:t>
+      </w:r>
+      <w:proofErr w:type="spellStart"/>
+      <w:r>
+        <w:t>panel.add</w:t>
+      </w:r>
+      <w:proofErr w:type="spellEnd"/>
+      <w:r>
+        <w:t>(</w:t>
+      </w:r>
+      <w:proofErr w:type="spellStart"/>
+      <w:proofErr w:type="gramStart"/>
+      <w:r>
+        <w:t>digitButtons</w:t>
+      </w:r>
+      <w:proofErr w:type="spellEnd"/>
+      <w:r>
+        <w:t>[</w:t>
+      </w:r>
+      <w:proofErr w:type="gramEnd"/>
+      <w:r>
+        <w:t>2]);</w:t>
+      </w:r>
+    </w:p>
+    <w:p>
+      <w:pPr>
+        <w:pStyle w:val="NoSpacing"/>
+      </w:pPr>
+      <w:r>
+        <w:t xml:space="preserve">        </w:t>
+      </w:r>
+      <w:proofErr w:type="spellStart"/>
+      <w:r>
+        <w:t>panel.add</w:t>
+      </w:r>
+      <w:proofErr w:type="spellEnd"/>
+      <w:r>
+        <w:t>(</w:t>
+      </w:r>
+      <w:proofErr w:type="spellStart"/>
+      <w:proofErr w:type="gramStart"/>
+      <w:r>
+        <w:t>digitButtons</w:t>
+      </w:r>
+      <w:proofErr w:type="spellEnd"/>
+      <w:r>
+        <w:t>[</w:t>
+      </w:r>
+      <w:proofErr w:type="gramEnd"/>
+      <w:r>
+        <w:t>3]);</w:t>
+      </w:r>
+    </w:p>
+    <w:p>
+      <w:pPr>
+        <w:pStyle w:val="NoSpacing"/>
+      </w:pPr>
+      <w:r>
+        <w:t xml:space="preserve">        </w:t>
+      </w:r>
+      <w:proofErr w:type="spellStart"/>
+      <w:r>
+        <w:t>panel.add</w:t>
+      </w:r>
+      <w:proofErr w:type="spellEnd"/>
+      <w:r>
+        <w:t>(subtract);</w:t>
+      </w:r>
+    </w:p>
+    <w:p>
+      <w:pPr>
+        <w:pStyle w:val="NoSpacing"/>
+      </w:pPr>
+    </w:p>
+    <w:p>
+      <w:pPr>
+        <w:pStyle w:val="NoSpacing"/>
+      </w:pPr>
+      <w:r>
+        <w:t xml:space="preserve">        </w:t>
+      </w:r>
+      <w:proofErr w:type="spellStart"/>
+      <w:r>
+        <w:t>panel.add</w:t>
+      </w:r>
+      <w:proofErr w:type="spellEnd"/>
+      <w:r>
+        <w:t>(</w:t>
+      </w:r>
+      <w:proofErr w:type="spellStart"/>
+      <w:proofErr w:type="gramStart"/>
+      <w:r>
+        <w:t>digitButtons</w:t>
+      </w:r>
+      <w:proofErr w:type="spellEnd"/>
+      <w:r>
+        <w:t>[</w:t>
+      </w:r>
+      <w:proofErr w:type="gramEnd"/>
+      <w:r>
+        <w:t>0]);</w:t>
+      </w:r>
+    </w:p>
+    <w:p>
+      <w:pPr>
+        <w:pStyle w:val="NoSpacing"/>
+      </w:pPr>
+      <w:r>
+        <w:t xml:space="preserve">        </w:t>
+      </w:r>
+      <w:proofErr w:type="spellStart"/>
+      <w:r>
+        <w:t>panel.add</w:t>
+      </w:r>
+      <w:proofErr w:type="spellEnd"/>
+      <w:r>
+        <w:t>(add);</w:t>
+      </w:r>
+    </w:p>
+    <w:p>
+      <w:pPr>
+        <w:pStyle w:val="NoSpacing"/>
+      </w:pPr>
+      <w:r>
+        <w:t xml:space="preserve">        </w:t>
+      </w:r>
+      <w:proofErr w:type="spellStart"/>
+      <w:r>
+        <w:t>panel.add</w:t>
+      </w:r>
+      <w:proofErr w:type="spellEnd"/>
+      <w:r>
+        <w:t>(modulo);</w:t>
+      </w:r>
+    </w:p>
+    <w:p>
+      <w:pPr>
+        <w:pStyle w:val="NoSpacing"/>
+      </w:pPr>
+      <w:r>
+        <w:t xml:space="preserve">        </w:t>
+      </w:r>
+      <w:proofErr w:type="spellStart"/>
+      <w:r>
+        <w:t>panel.add</w:t>
+      </w:r>
+      <w:proofErr w:type="spellEnd"/>
+      <w:r>
+        <w:t>(</w:t>
+      </w:r>
+      <w:proofErr w:type="spellStart"/>
+      <w:r>
+        <w:t>equalTo</w:t>
+      </w:r>
+      <w:proofErr w:type="spellEnd"/>
+      <w:r>
+        <w:t>);</w:t>
+      </w:r>
+    </w:p>
+    <w:p>
+      <w:pPr>
+        <w:pStyle w:val="NoSpacing"/>
+      </w:pPr>
+    </w:p>
+    <w:p>
+      <w:pPr>
+        <w:pStyle w:val="NoSpacing"/>
+      </w:pPr>
+      <w:r>
+        <w:t xml:space="preserve">        </w:t>
+      </w:r>
+      <w:proofErr w:type="spellStart"/>
+      <w:proofErr w:type="gramStart"/>
+      <w:r>
+        <w:t>frame.add</w:t>
+      </w:r>
+      <w:proofErr w:type="spellEnd"/>
+      <w:r>
+        <w:t>(</w:t>
+      </w:r>
+      <w:proofErr w:type="gramEnd"/>
+      <w:r>
+        <w:t xml:space="preserve">panel, </w:t>
+      </w:r>
+      <w:proofErr w:type="spellStart"/>
+      <w:r>
+        <w:t>BorderLayout.CENTER</w:t>
+      </w:r>
+      <w:proofErr w:type="spellEnd"/>
+      <w:r>
+        <w:t>);</w:t>
+      </w:r>
+    </w:p>
+    <w:p>
+      <w:pPr>
+        <w:pStyle w:val="NoSpacing"/>
+      </w:pPr>
+    </w:p>
+    <w:p>
+      <w:pPr>
+        <w:pStyle w:val="NoSpacing"/>
+      </w:pPr>
+      <w:r>
+        <w:t xml:space="preserve">        </w:t>
+      </w:r>
+      <w:proofErr w:type="spellStart"/>
+      <w:proofErr w:type="gramStart"/>
+      <w:r>
+        <w:t>frame.add</w:t>
+      </w:r>
+      <w:proofErr w:type="spellEnd"/>
+      <w:r>
+        <w:t>(</w:t>
+      </w:r>
+      <w:proofErr w:type="gramEnd"/>
+      <w:r>
+        <w:t xml:space="preserve">clear, </w:t>
+      </w:r>
+      <w:proofErr w:type="spellStart"/>
+      <w:r>
+        <w:t>BorderLayout.SOUTH</w:t>
+      </w:r>
+      <w:proofErr w:type="spellEnd"/>
+      <w:r>
+        <w:t>);</w:t>
+      </w:r>
+    </w:p>
+    <w:p>
+      <w:pPr>
+        <w:pStyle w:val="NoSpacing"/>
+      </w:pPr>
+    </w:p>
+    <w:p>
+      <w:pPr>
+        <w:pStyle w:val="NoSpacing"/>
+      </w:pPr>
+      <w:r>
+        <w:t xml:space="preserve">        </w:t>
+      </w:r>
+      <w:proofErr w:type="spellStart"/>
+      <w:proofErr w:type="gramStart"/>
+      <w:r>
+        <w:t>frame.setSize</w:t>
+      </w:r>
+      <w:proofErr w:type="spellEnd"/>
+      <w:proofErr w:type="gramEnd"/>
+      <w:r>
+        <w:t>(400, 400);</w:t>
+      </w:r>
+    </w:p>
+    <w:p>
+      <w:pPr>
+        <w:pStyle w:val="NoSpacing"/>
+      </w:pPr>
+      <w:r>
+        <w:t xml:space="preserve">        </w:t>
+      </w:r>
+      <w:proofErr w:type="spellStart"/>
+      <w:proofErr w:type="gramStart"/>
+      <w:r>
+        <w:t>frame.setVisible</w:t>
+      </w:r>
+      <w:proofErr w:type="spellEnd"/>
+      <w:proofErr w:type="gramEnd"/>
+      <w:r>
+        <w:t>(true);</w:t>
+      </w:r>
+    </w:p>
+    <w:p>
+      <w:pPr>
+        <w:pStyle w:val="NoSpacing"/>
+      </w:pPr>
+      <w:r>
+        <w:t>    }</w:t>
+      </w:r>
+    </w:p>
+    <w:p>
+      <w:pPr>
+        <w:pStyle w:val="NoSpacing"/>
+      </w:pPr>
+    </w:p>
+    <w:p>
+      <w:pPr>
+        <w:pStyle w:val="NoSpacing"/>
+      </w:pPr>
+      <w:r>
+        <w:t xml:space="preserve">    @Override </w:t>
+      </w:r>
+    </w:p>
+    <w:p>
+      <w:pPr>
+        <w:pStyle w:val="NoSpacing"/>
+      </w:pPr>
+      <w:r>
+        <w:t xml:space="preserve">    public void </w:t>
+      </w:r>
+      <w:proofErr w:type="spellStart"/>
+      <w:proofErr w:type="gramStart"/>
+      <w:r>
+        <w:t>actionPerformed</w:t>
+      </w:r>
+      <w:proofErr w:type="spellEnd"/>
+      <w:r>
+        <w:t>(</w:t>
+      </w:r>
+      <w:proofErr w:type="spellStart"/>
+      <w:proofErr w:type="gramEnd"/>
+      <w:r>
+        <w:t>ActionEvent</w:t>
+      </w:r>
+      <w:proofErr w:type="spellEnd"/>
+      <w:r>
+        <w:t xml:space="preserve"> e) {</w:t>
+      </w:r>
+    </w:p>
+    <w:p>
+      <w:pPr>
+        <w:pStyle w:val="NoSpacing"/>
+      </w:pPr>
+      <w:r>
+        <w:t xml:space="preserve">        String command = </w:t>
+      </w:r>
+      <w:proofErr w:type="spellStart"/>
+      <w:proofErr w:type="gramStart"/>
+      <w:r>
+        <w:t>e.getActionCommand</w:t>
+      </w:r>
+      <w:proofErr w:type="spellEnd"/>
+      <w:proofErr w:type="gramEnd"/>
+      <w:r>
+        <w:t>();</w:t>
+      </w:r>
+    </w:p>
+    <w:p>
+      <w:pPr>
+        <w:pStyle w:val="NoSpacing"/>
+      </w:pPr>
+      <w:r>
+        <w:t xml:space="preserve">        </w:t>
+      </w:r>
+    </w:p>
+    <w:p>
+      <w:pPr>
+        <w:pStyle w:val="NoSpacing"/>
+      </w:pPr>
+      <w:r>
+        <w:t>        try {</w:t>
+      </w:r>
+    </w:p>
+    <w:p>
+      <w:pPr>
+        <w:pStyle w:val="NoSpacing"/>
+      </w:pPr>
+      <w:r>
+        <w:t>            if(</w:t>
+      </w:r>
+      <w:proofErr w:type="spellStart"/>
+      <w:proofErr w:type="gramStart"/>
+      <w:r>
+        <w:t>command.charAt</w:t>
+      </w:r>
+      <w:proofErr w:type="spellEnd"/>
+      <w:proofErr w:type="gramEnd"/>
+      <w:r>
+        <w:t xml:space="preserve">(0) &gt;= '0' &amp;&amp; </w:t>
+      </w:r>
+      <w:proofErr w:type="spellStart"/>
+      <w:proofErr w:type="gramStart"/>
+      <w:r>
+        <w:t>command.charAt</w:t>
+      </w:r>
+      <w:proofErr w:type="spellEnd"/>
+      <w:proofErr w:type="gramEnd"/>
+      <w:r>
+        <w:t>(0) &lt;= '9') {</w:t>
+      </w:r>
+    </w:p>
+    <w:p>
+      <w:pPr>
+        <w:pStyle w:val="NoSpacing"/>
+      </w:pPr>
+      <w:r>
+        <w:t>                if (</w:t>
+      </w:r>
+      <w:proofErr w:type="spellStart"/>
+      <w:r>
+        <w:t>calculationDone</w:t>
+      </w:r>
+      <w:proofErr w:type="spellEnd"/>
+      <w:r>
+        <w:t>) {</w:t>
+      </w:r>
+    </w:p>
+    <w:p>
+      <w:pPr>
+        <w:pStyle w:val="NoSpacing"/>
+      </w:pPr>
+      <w:r>
+        <w:t xml:space="preserve">                    </w:t>
+      </w:r>
+      <w:proofErr w:type="spellStart"/>
+      <w:proofErr w:type="gramStart"/>
+      <w:r>
+        <w:t>display.setText</w:t>
+      </w:r>
+      <w:proofErr w:type="spellEnd"/>
+      <w:proofErr w:type="gramEnd"/>
+      <w:r>
+        <w:t>("");</w:t>
+      </w:r>
+    </w:p>
+    <w:p>
+      <w:pPr>
+        <w:pStyle w:val="NoSpacing"/>
+      </w:pPr>
+      <w:r>
+        <w:t xml:space="preserve">                    </w:t>
+      </w:r>
+      <w:proofErr w:type="spellStart"/>
+      <w:r>
+        <w:t>calculationDone</w:t>
+      </w:r>
+      <w:proofErr w:type="spellEnd"/>
+      <w:r>
+        <w:t xml:space="preserve"> = false;</w:t>
+      </w:r>
+    </w:p>
+    <w:p>
+      <w:pPr>
+        <w:pStyle w:val="NoSpacing"/>
+      </w:pPr>
+      <w:r>
+        <w:t>                    operator = '\0';</w:t>
+      </w:r>
+    </w:p>
+    <w:p>
+      <w:pPr>
+        <w:pStyle w:val="NoSpacing"/>
+      </w:pPr>
+      <w:r>
+        <w:t>                }</w:t>
+      </w:r>
+    </w:p>
+    <w:p>
+      <w:pPr>
+        <w:pStyle w:val="NoSpacing"/>
+      </w:pPr>
+      <w:r>
+        <w:t xml:space="preserve">                </w:t>
+      </w:r>
+      <w:proofErr w:type="spellStart"/>
+      <w:proofErr w:type="gramStart"/>
+      <w:r>
+        <w:t>display.setText</w:t>
+      </w:r>
+      <w:proofErr w:type="spellEnd"/>
+      <w:proofErr w:type="gramEnd"/>
+      <w:r>
+        <w:t>(</w:t>
+      </w:r>
+      <w:proofErr w:type="spellStart"/>
+      <w:proofErr w:type="gramStart"/>
+      <w:r>
+        <w:t>display.getText</w:t>
+      </w:r>
+      <w:proofErr w:type="spellEnd"/>
+      <w:proofErr w:type="gramEnd"/>
+      <w:r>
+        <w:t>() + command);</w:t>
+      </w:r>
+    </w:p>
+    <w:p>
+      <w:pPr>
+        <w:pStyle w:val="NoSpacing"/>
+      </w:pPr>
+      <w:r>
+        <w:t xml:space="preserve">            } </w:t>
+      </w:r>
+    </w:p>
+    <w:p>
+      <w:pPr>
+        <w:pStyle w:val="NoSpacing"/>
+      </w:pPr>
+      <w:r>
+        <w:t xml:space="preserve">            </w:t>
+      </w:r>
+    </w:p>
+    <w:p>
+      <w:pPr>
+        <w:pStyle w:val="NoSpacing"/>
+      </w:pPr>
+      <w:r>
+        <w:lastRenderedPageBreak/>
+        <w:t>            else if (</w:t>
+      </w:r>
+      <w:proofErr w:type="spellStart"/>
+      <w:proofErr w:type="gramStart"/>
+      <w:r>
+        <w:t>command.equals</w:t>
+      </w:r>
+      <w:proofErr w:type="spellEnd"/>
+      <w:proofErr w:type="gramEnd"/>
+      <w:r>
+        <w:t>("C")) {</w:t>
+      </w:r>
+    </w:p>
+    <w:p>
+      <w:pPr>
+        <w:pStyle w:val="NoSpacing"/>
+      </w:pPr>
+      <w:r>
+        <w:t xml:space="preserve">                </w:t>
+      </w:r>
+      <w:proofErr w:type="spellStart"/>
+      <w:proofErr w:type="gramStart"/>
+      <w:r>
+        <w:t>display.setText</w:t>
+      </w:r>
+      <w:proofErr w:type="spellEnd"/>
+      <w:proofErr w:type="gramEnd"/>
+      <w:r>
+        <w:t>("");</w:t>
+      </w:r>
+    </w:p>
+    <w:p>
+      <w:pPr>
+        <w:pStyle w:val="NoSpacing"/>
+      </w:pPr>
+      <w:r>
+        <w:t>                num1 = 0;</w:t>
+      </w:r>
+    </w:p>
+    <w:p>
+      <w:pPr>
+        <w:pStyle w:val="NoSpacing"/>
+      </w:pPr>
+      <w:r>
+        <w:t>                num2 = 0;</w:t>
+      </w:r>
+    </w:p>
+    <w:p>
+      <w:pPr>
+        <w:pStyle w:val="NoSpacing"/>
+      </w:pPr>
+      <w:r>
+        <w:t>                result = 0;</w:t>
+      </w:r>
+    </w:p>
+    <w:p>
+      <w:pPr>
+        <w:pStyle w:val="NoSpacing"/>
+      </w:pPr>
+      <w:r>
+        <w:t>                operator = '\0';</w:t>
+      </w:r>
+    </w:p>
+    <w:p>
+      <w:pPr>
+        <w:pStyle w:val="NoSpacing"/>
+      </w:pPr>
+      <w:r>
+        <w:t xml:space="preserve">                </w:t>
+      </w:r>
+      <w:proofErr w:type="spellStart"/>
+      <w:r>
+        <w:t>calculationDone</w:t>
+      </w:r>
+      <w:proofErr w:type="spellEnd"/>
+      <w:r>
+        <w:t xml:space="preserve"> = false;</w:t>
+      </w:r>
+    </w:p>
+    <w:p>
+      <w:pPr>
+        <w:pStyle w:val="NoSpacing"/>
+      </w:pPr>
+      <w:r>
+        <w:t xml:space="preserve">            } </w:t>
+      </w:r>
+    </w:p>
+    <w:p>
+      <w:pPr>
+        <w:pStyle w:val="NoSpacing"/>
+      </w:pPr>
+      <w:r>
+        <w:t xml:space="preserve">            </w:t>
+      </w:r>
+    </w:p>
+    <w:p>
+      <w:pPr>
+        <w:pStyle w:val="NoSpacing"/>
+      </w:pPr>
+      <w:r>
+        <w:t>            else if (</w:t>
+      </w:r>
+    </w:p>
+    <w:p>
+      <w:pPr>
+        <w:pStyle w:val="NoSpacing"/>
+      </w:pPr>
+      <w:r>
+        <w:t xml:space="preserve">                </w:t>
+      </w:r>
+      <w:proofErr w:type="spellStart"/>
+      <w:proofErr w:type="gramStart"/>
+      <w:r>
+        <w:t>command.equals</w:t>
+      </w:r>
+      <w:proofErr w:type="spellEnd"/>
+      <w:proofErr w:type="gramEnd"/>
+      <w:r>
+        <w:t>("/") ||</w:t>
+      </w:r>
+    </w:p>
+    <w:p>
+      <w:pPr>
+        <w:pStyle w:val="NoSpacing"/>
+      </w:pPr>
+      <w:r>
+        <w:t xml:space="preserve">                </w:t>
+      </w:r>
+      <w:proofErr w:type="spellStart"/>
+      <w:proofErr w:type="gramStart"/>
+      <w:r>
+        <w:t>command.equals</w:t>
+      </w:r>
+      <w:proofErr w:type="spellEnd"/>
+      <w:proofErr w:type="gramEnd"/>
+      <w:r>
+        <w:t>("*") ||</w:t>
+      </w:r>
+    </w:p>
+    <w:p>
+      <w:pPr>
+        <w:pStyle w:val="NoSpacing"/>
+      </w:pPr>
+      <w:r>
+        <w:t xml:space="preserve">                </w:t>
+      </w:r>
+      <w:proofErr w:type="spellStart"/>
+      <w:proofErr w:type="gramStart"/>
+      <w:r>
+        <w:t>command.equals</w:t>
+      </w:r>
+      <w:proofErr w:type="spellEnd"/>
+      <w:proofErr w:type="gramEnd"/>
+      <w:r>
+        <w:t>("+") ||</w:t>
+      </w:r>
+    </w:p>
+    <w:p>
+      <w:pPr>
+        <w:pStyle w:val="NoSpacing"/>
+      </w:pPr>
+      <w:r>
+        <w:t xml:space="preserve">                </w:t>
+      </w:r>
+      <w:proofErr w:type="spellStart"/>
+      <w:proofErr w:type="gramStart"/>
+      <w:r>
+        <w:t>command.equals</w:t>
+      </w:r>
+      <w:proofErr w:type="spellEnd"/>
+      <w:proofErr w:type="gramEnd"/>
+      <w:r>
+        <w:t>("-") ||</w:t>
+      </w:r>
+    </w:p>
+    <w:p>
+      <w:pPr>
+        <w:pStyle w:val="NoSpacing"/>
+      </w:pPr>
+      <w:r>
+        <w:t xml:space="preserve">                </w:t>
+      </w:r>
+      <w:proofErr w:type="spellStart"/>
+      <w:proofErr w:type="gramStart"/>
+      <w:r>
+        <w:t>command.equals</w:t>
+      </w:r>
+      <w:proofErr w:type="spellEnd"/>
+      <w:proofErr w:type="gramEnd"/>
+      <w:r>
+        <w:t>("%")</w:t>
+      </w:r>
+    </w:p>
+    <w:p>
+      <w:pPr>
+        <w:pStyle w:val="NoSpacing"/>
+      </w:pPr>
+      <w:r>
+        <w:t>            ) {</w:t>
+      </w:r>
+    </w:p>
+    <w:p>
+      <w:pPr>
+        <w:pStyle w:val="NoSpacing"/>
+      </w:pPr>
+      <w:r>
+        <w:t>                if (</w:t>
+      </w:r>
+      <w:proofErr w:type="spellStart"/>
+      <w:proofErr w:type="gramStart"/>
+      <w:r>
+        <w:t>display.getText</w:t>
+      </w:r>
+      <w:proofErr w:type="spellEnd"/>
+      <w:proofErr w:type="gramEnd"/>
+      <w:r>
+        <w:t>(</w:t>
+      </w:r>
+      <w:proofErr w:type="gramStart"/>
+      <w:r>
+        <w:t>).</w:t>
+      </w:r>
+      <w:proofErr w:type="spellStart"/>
+      <w:r>
+        <w:t>isEmpty</w:t>
+      </w:r>
+      <w:proofErr w:type="spellEnd"/>
+      <w:proofErr w:type="gramEnd"/>
+      <w:r>
+        <w:t>()) {</w:t>
+      </w:r>
+    </w:p>
+    <w:p>
+      <w:pPr>
+        <w:pStyle w:val="NoSpacing"/>
+      </w:pPr>
+      <w:r>
+        <w:t xml:space="preserve">                    throw new </w:t>
+      </w:r>
+      <w:proofErr w:type="spellStart"/>
+      <w:proofErr w:type="gramStart"/>
+      <w:r>
+        <w:t>NumberFormatException</w:t>
+      </w:r>
+      <w:proofErr w:type="spellEnd"/>
+      <w:r>
+        <w:t>(</w:t>
+      </w:r>
+      <w:proofErr w:type="gramEnd"/>
+      <w:r>
+        <w:t>"Enter a number before choosing an operator");</w:t>
+      </w:r>
+    </w:p>
+    <w:p>
+      <w:pPr>
+        <w:pStyle w:val="NoSpacing"/>
+      </w:pPr>
+      <w:r>
+        <w:t>                }</w:t>
+      </w:r>
+    </w:p>
+    <w:p>
+      <w:pPr>
+        <w:pStyle w:val="NoSpacing"/>
+      </w:pPr>
+    </w:p>
+    <w:p>
+      <w:pPr>
+        <w:pStyle w:val="NoSpacing"/>
+      </w:pPr>
+      <w:r>
+        <w:t xml:space="preserve">                num1 = </w:t>
+      </w:r>
+      <w:proofErr w:type="spellStart"/>
+      <w:r>
+        <w:t>Double.parseDouble</w:t>
+      </w:r>
+      <w:proofErr w:type="spellEnd"/>
+      <w:r>
+        <w:t>(</w:t>
+      </w:r>
+      <w:proofErr w:type="spellStart"/>
+      <w:proofErr w:type="gramStart"/>
+      <w:r>
+        <w:t>display.getText</w:t>
+      </w:r>
+      <w:proofErr w:type="spellEnd"/>
+      <w:proofErr w:type="gramEnd"/>
+      <w:r>
+        <w:t>());</w:t>
+      </w:r>
+    </w:p>
+    <w:p>
+      <w:pPr>
+        <w:pStyle w:val="NoSpacing"/>
+      </w:pPr>
+      <w:r>
+        <w:t xml:space="preserve">                operator = </w:t>
+      </w:r>
+      <w:proofErr w:type="spellStart"/>
+      <w:proofErr w:type="gramStart"/>
+      <w:r>
+        <w:t>command.charAt</w:t>
+      </w:r>
+      <w:proofErr w:type="spellEnd"/>
+      <w:proofErr w:type="gramEnd"/>
+      <w:r>
+        <w:t>(0);</w:t>
+      </w:r>
+    </w:p>
+    <w:p>
+      <w:pPr>
+        <w:pStyle w:val="NoSpacing"/>
+      </w:pPr>
+      <w:r>
+        <w:t xml:space="preserve">                </w:t>
+      </w:r>
+      <w:proofErr w:type="spellStart"/>
+      <w:r>
+        <w:t>calculationDone</w:t>
+      </w:r>
+      <w:proofErr w:type="spellEnd"/>
+      <w:r>
+        <w:t xml:space="preserve"> = false;</w:t>
+      </w:r>
+    </w:p>
+    <w:p>
+      <w:pPr>
+        <w:pStyle w:val="NoSpacing"/>
+      </w:pPr>
+      <w:r>
+        <w:t xml:space="preserve">                </w:t>
+      </w:r>
+      <w:proofErr w:type="spellStart"/>
+      <w:proofErr w:type="gramStart"/>
+      <w:r>
+        <w:t>display.setText</w:t>
+      </w:r>
+      <w:proofErr w:type="spellEnd"/>
+      <w:proofErr w:type="gramEnd"/>
+      <w:r>
+        <w:t>("");</w:t>
+      </w:r>
+    </w:p>
+    <w:p>
+      <w:pPr>
+        <w:pStyle w:val="NoSpacing"/>
+      </w:pPr>
+      <w:r>
+        <w:t xml:space="preserve">            } </w:t>
+      </w:r>
+    </w:p>
+    <w:p>
+      <w:pPr>
+        <w:pStyle w:val="NoSpacing"/>
+      </w:pPr>
+      <w:r>
+        <w:t xml:space="preserve">            </w:t>
+      </w:r>
+    </w:p>
+    <w:p>
+      <w:pPr>
+        <w:pStyle w:val="NoSpacing"/>
+      </w:pPr>
+      <w:r>
+        <w:t>            else if (</w:t>
+      </w:r>
+      <w:proofErr w:type="spellStart"/>
+      <w:proofErr w:type="gramStart"/>
+      <w:r>
+        <w:t>command.equals</w:t>
+      </w:r>
+      <w:proofErr w:type="spellEnd"/>
+      <w:proofErr w:type="gramEnd"/>
+      <w:r>
+        <w:t>("=")) {</w:t>
+      </w:r>
+    </w:p>
+    <w:p>
+      <w:pPr>
+        <w:pStyle w:val="NoSpacing"/>
+      </w:pPr>
+      <w:r>
+        <w:t>                if (operator == '\0') {</w:t>
+      </w:r>
+    </w:p>
+    <w:p>
+      <w:pPr>
+        <w:pStyle w:val="NoSpacing"/>
+      </w:pPr>
+      <w:r>
+        <w:t xml:space="preserve">                    throw new </w:t>
+      </w:r>
+      <w:proofErr w:type="spellStart"/>
+      <w:proofErr w:type="gramStart"/>
+      <w:r>
+        <w:t>NumberFormatException</w:t>
+      </w:r>
+      <w:proofErr w:type="spellEnd"/>
+      <w:r>
+        <w:t>(</w:t>
+      </w:r>
+      <w:proofErr w:type="gramEnd"/>
+      <w:r>
+        <w:t>"Choose an operator");</w:t>
+      </w:r>
+    </w:p>
+    <w:p>
+      <w:pPr>
+        <w:pStyle w:val="NoSpacing"/>
+      </w:pPr>
+      <w:r>
+        <w:t>                }</w:t>
+      </w:r>
+    </w:p>
+    <w:p>
+      <w:pPr>
+        <w:pStyle w:val="NoSpacing"/>
+      </w:pPr>
+    </w:p>
+    <w:p>
+      <w:pPr>
+        <w:pStyle w:val="NoSpacing"/>
+      </w:pPr>
+      <w:r>
+        <w:t xml:space="preserve">                if </w:t>
+      </w:r>
+      <w:proofErr w:type="gramStart"/>
+      <w:r>
+        <w:t>(!</w:t>
+      </w:r>
+      <w:proofErr w:type="spellStart"/>
+      <w:r>
+        <w:t>calculationDone</w:t>
+      </w:r>
+      <w:proofErr w:type="spellEnd"/>
+      <w:proofErr w:type="gramEnd"/>
+      <w:r>
+        <w:t xml:space="preserve"> &amp;&amp; </w:t>
+      </w:r>
+      <w:proofErr w:type="spellStart"/>
+      <w:proofErr w:type="gramStart"/>
+      <w:r>
+        <w:t>display.getText</w:t>
+      </w:r>
+      <w:proofErr w:type="spellEnd"/>
+      <w:proofErr w:type="gramEnd"/>
+      <w:r>
+        <w:t>(</w:t>
+      </w:r>
+      <w:proofErr w:type="gramStart"/>
+      <w:r>
+        <w:t>).</w:t>
+      </w:r>
+      <w:proofErr w:type="spellStart"/>
+      <w:r>
+        <w:t>isEmpty</w:t>
+      </w:r>
+      <w:proofErr w:type="spellEnd"/>
+      <w:proofErr w:type="gramEnd"/>
+      <w:r>
+        <w:t>()) {</w:t>
+      </w:r>
+    </w:p>
+    <w:p>
+      <w:pPr>
+        <w:pStyle w:val="NoSpacing"/>
+      </w:pPr>
+      <w:r>
+        <w:t xml:space="preserve">                    throw new </w:t>
+      </w:r>
+      <w:proofErr w:type="spellStart"/>
+      <w:proofErr w:type="gramStart"/>
+      <w:r>
+        <w:t>NumberFormatException</w:t>
+      </w:r>
+      <w:proofErr w:type="spellEnd"/>
+      <w:r>
+        <w:t>(</w:t>
+      </w:r>
+      <w:proofErr w:type="gramEnd"/>
+      <w:r>
+        <w:t>"Enter some number first");</w:t>
+      </w:r>
+    </w:p>
+    <w:p>
+      <w:pPr>
+        <w:pStyle w:val="NoSpacing"/>
+      </w:pPr>
+      <w:r>
+        <w:t>                }</w:t>
+      </w:r>
+    </w:p>
+    <w:p>
+      <w:pPr>
+        <w:pStyle w:val="NoSpacing"/>
+      </w:pPr>
+    </w:p>
+    <w:p>
+      <w:pPr>
+        <w:pStyle w:val="NoSpacing"/>
+      </w:pPr>
+      <w:r>
+        <w:t xml:space="preserve">                if </w:t>
+      </w:r>
+      <w:proofErr w:type="gramStart"/>
+      <w:r>
+        <w:t>(!</w:t>
+      </w:r>
+      <w:proofErr w:type="spellStart"/>
+      <w:r>
+        <w:t>calculationDone</w:t>
+      </w:r>
+      <w:proofErr w:type="spellEnd"/>
+      <w:proofErr w:type="gramEnd"/>
+      <w:r>
+        <w:t>) {</w:t>
+      </w:r>
+    </w:p>
+    <w:p>
+      <w:pPr>
+        <w:pStyle w:val="NoSpacing"/>
+      </w:pPr>
+      <w:r>
+        <w:t xml:space="preserve">                    num2 = </w:t>
+      </w:r>
+      <w:proofErr w:type="spellStart"/>
+      <w:r>
+        <w:t>Double.parseDouble</w:t>
+      </w:r>
+      <w:proofErr w:type="spellEnd"/>
+      <w:r>
+        <w:t>(</w:t>
+      </w:r>
+      <w:proofErr w:type="spellStart"/>
+      <w:proofErr w:type="gramStart"/>
+      <w:r>
+        <w:t>display.getText</w:t>
+      </w:r>
+      <w:proofErr w:type="spellEnd"/>
+      <w:proofErr w:type="gramEnd"/>
+      <w:r>
+        <w:t>());</w:t>
+      </w:r>
+    </w:p>
+    <w:p>
+      <w:pPr>
+        <w:pStyle w:val="NoSpacing"/>
+      </w:pPr>
+      <w:r>
+        <w:t>                }</w:t>
+      </w:r>
+    </w:p>
+    <w:p>
+      <w:pPr>
+        <w:pStyle w:val="NoSpacing"/>
+      </w:pPr>
+    </w:p>
+    <w:p>
+      <w:pPr>
+        <w:pStyle w:val="NoSpacing"/>
+      </w:pPr>
+      <w:r>
+        <w:t>                switch(operator) {</w:t>
+      </w:r>
+    </w:p>
+    <w:p>
+      <w:pPr>
+        <w:pStyle w:val="NoSpacing"/>
+      </w:pPr>
+      <w:r>
+        <w:t>                    case '+':</w:t>
+      </w:r>
+    </w:p>
+    <w:p>
+      <w:pPr>
+        <w:pStyle w:val="NoSpacing"/>
+      </w:pPr>
+      <w:r>
+        <w:t>                        result = num1 + num2;</w:t>
+      </w:r>
+    </w:p>
+    <w:p>
+      <w:pPr>
+        <w:pStyle w:val="NoSpacing"/>
+      </w:pPr>
+      <w:r>
+        <w:t>                        break;</w:t>
+      </w:r>
+    </w:p>
+    <w:p>
+      <w:pPr>
+        <w:pStyle w:val="NoSpacing"/>
+      </w:pPr>
+      <w:r>
+        <w:t>                    case '-':</w:t>
+      </w:r>
+    </w:p>
+    <w:p>
+      <w:pPr>
+        <w:pStyle w:val="NoSpacing"/>
+      </w:pPr>
+      <w:r>
+        <w:t>                        result = num1 - num2;</w:t>
+      </w:r>
+    </w:p>
+    <w:p>
+      <w:pPr>
+        <w:pStyle w:val="NoSpacing"/>
+      </w:pPr>
+      <w:r>
+        <w:t>                        break;</w:t>
+      </w:r>
+    </w:p>
+    <w:p>
+      <w:pPr>
+        <w:pStyle w:val="NoSpacing"/>
+      </w:pPr>
+      <w:r>
+        <w:t>                    case '*':</w:t>
+      </w:r>
+    </w:p>
+    <w:p>
+      <w:pPr>
+        <w:pStyle w:val="NoSpacing"/>
+      </w:pPr>
+      <w:r>
+        <w:t>                        result = num1 * num2;</w:t>
+      </w:r>
+    </w:p>
+    <w:p>
+      <w:pPr>
+        <w:pStyle w:val="NoSpacing"/>
+      </w:pPr>
+      <w:r>
+        <w:lastRenderedPageBreak/>
+        <w:t>                        break;</w:t>
+      </w:r>
+    </w:p>
+    <w:p>
+      <w:pPr>
+        <w:pStyle w:val="NoSpacing"/>
+      </w:pPr>
+      <w:r>
+        <w:t>                    case '/':</w:t>
+      </w:r>
+    </w:p>
+    <w:p>
+      <w:pPr>
+        <w:pStyle w:val="NoSpacing"/>
+      </w:pPr>
+      <w:r>
+        <w:t xml:space="preserve">                        </w:t>
+      </w:r>
+      <w:proofErr w:type="gramStart"/>
+      <w:r>
+        <w:t>if(</w:t>
+      </w:r>
+      <w:proofErr w:type="gramEnd"/>
+      <w:r>
+        <w:t>num2 == 0) {</w:t>
+      </w:r>
+    </w:p>
+    <w:p>
+      <w:pPr>
+        <w:pStyle w:val="NoSpacing"/>
+      </w:pPr>
+      <w:r>
+        <w:t xml:space="preserve">                            throw new </w:t>
+      </w:r>
+      <w:proofErr w:type="spellStart"/>
+      <w:proofErr w:type="gramStart"/>
+      <w:r>
+        <w:t>ArithmeticException</w:t>
+      </w:r>
+      <w:proofErr w:type="spellEnd"/>
+      <w:r>
+        <w:t>(</w:t>
+      </w:r>
+      <w:proofErr w:type="gramEnd"/>
+      <w:r>
+        <w:t>"Cannot divide by zero");</w:t>
+      </w:r>
+    </w:p>
+    <w:p>
+      <w:pPr>
+        <w:pStyle w:val="NoSpacing"/>
+      </w:pPr>
+      <w:r>
+        <w:t>                        }</w:t>
+      </w:r>
+    </w:p>
+    <w:p>
+      <w:pPr>
+        <w:pStyle w:val="NoSpacing"/>
+      </w:pPr>
+      <w:r>
+        <w:t>                        result = num1 / num2;</w:t>
+      </w:r>
+    </w:p>
+    <w:p>
+      <w:pPr>
+        <w:pStyle w:val="NoSpacing"/>
+      </w:pPr>
+      <w:r>
+        <w:t>                        break;</w:t>
+      </w:r>
+    </w:p>
+    <w:p>
+      <w:pPr>
+        <w:pStyle w:val="NoSpacing"/>
+      </w:pPr>
+      <w:r>
+        <w:t>                    case '%':</w:t>
+      </w:r>
+    </w:p>
+    <w:p>
+      <w:pPr>
+        <w:pStyle w:val="NoSpacing"/>
+      </w:pPr>
+      <w:r>
+        <w:t xml:space="preserve">                        </w:t>
+      </w:r>
+      <w:proofErr w:type="gramStart"/>
+      <w:r>
+        <w:t>if(</w:t>
+      </w:r>
+      <w:proofErr w:type="gramEnd"/>
+      <w:r>
+        <w:t>num2 == 0) {</w:t>
+      </w:r>
+    </w:p>
+    <w:p>
+      <w:pPr>
+        <w:pStyle w:val="NoSpacing"/>
+      </w:pPr>
+      <w:r>
+        <w:t xml:space="preserve">                            throw new </w:t>
+      </w:r>
+      <w:proofErr w:type="spellStart"/>
+      <w:proofErr w:type="gramStart"/>
+      <w:r>
+        <w:t>ArithmeticException</w:t>
+      </w:r>
+      <w:proofErr w:type="spellEnd"/>
+      <w:r>
+        <w:t>(</w:t>
+      </w:r>
+      <w:proofErr w:type="gramEnd"/>
+      <w:r>
+        <w:t>"Cannot divide by zero");</w:t>
+      </w:r>
+    </w:p>
+    <w:p>
+      <w:pPr>
+        <w:pStyle w:val="NoSpacing"/>
+      </w:pPr>
+      <w:r>
+        <w:t>                        }</w:t>
+      </w:r>
+    </w:p>
+    <w:p>
+      <w:pPr>
+        <w:pStyle w:val="NoSpacing"/>
+      </w:pPr>
+      <w:r>
+        <w:t>                        result = num1 % num2;</w:t>
+      </w:r>
+    </w:p>
+    <w:p>
+      <w:pPr>
+        <w:pStyle w:val="NoSpacing"/>
+      </w:pPr>
+      <w:r>
+        <w:t>                        break;</w:t>
+      </w:r>
+    </w:p>
+    <w:p>
+      <w:pPr>
+        <w:pStyle w:val="NoSpacing"/>
+      </w:pPr>
+      <w:r>
+        <w:t>                }</w:t>
+      </w:r>
+    </w:p>
+    <w:p>
+      <w:pPr>
+        <w:pStyle w:val="NoSpacing"/>
+      </w:pPr>
+    </w:p>
+    <w:p>
+      <w:pPr>
+        <w:pStyle w:val="NoSpacing"/>
+      </w:pPr>
+      <w:r>
+        <w:t xml:space="preserve">                </w:t>
+      </w:r>
+      <w:proofErr w:type="spellStart"/>
+      <w:proofErr w:type="gramStart"/>
+      <w:r>
+        <w:t>display.setText</w:t>
+      </w:r>
+      <w:proofErr w:type="spellEnd"/>
+      <w:proofErr w:type="gramEnd"/>
+      <w:r>
+        <w:t>(</w:t>
+      </w:r>
+      <w:proofErr w:type="spellStart"/>
+      <w:r>
+        <w:t>String.valueOf</w:t>
+      </w:r>
+      <w:proofErr w:type="spellEnd"/>
+      <w:r>
+        <w:t>(result));</w:t>
+      </w:r>
+    </w:p>
+    <w:p>
+      <w:pPr>
+        <w:pStyle w:val="NoSpacing"/>
+      </w:pPr>
+      <w:r>
+        <w:t>                num1 = result;</w:t>
+      </w:r>
+    </w:p>
+    <w:p>
+      <w:pPr>
+        <w:pStyle w:val="NoSpacing"/>
+      </w:pPr>
+      <w:r>
+        <w:t xml:space="preserve">                </w:t>
+      </w:r>
+      <w:proofErr w:type="spellStart"/>
+      <w:r>
+        <w:t>calculationDone</w:t>
+      </w:r>
+      <w:proofErr w:type="spellEnd"/>
+      <w:r>
+        <w:t xml:space="preserve"> = true;</w:t>
+      </w:r>
+    </w:p>
+    <w:p>
+      <w:pPr>
+        <w:pStyle w:val="NoSpacing"/>
+      </w:pPr>
+      <w:r>
+        <w:t>            }</w:t>
+      </w:r>
+    </w:p>
+    <w:p>
+      <w:pPr>
+        <w:pStyle w:val="NoSpacing"/>
+      </w:pPr>
+    </w:p>
+    <w:p>
+      <w:pPr>
+        <w:pStyle w:val="NoSpacing"/>
+      </w:pPr>
+      <w:r>
+        <w:t>        } catch (</w:t>
+      </w:r>
+      <w:proofErr w:type="spellStart"/>
+      <w:r>
+        <w:t>ArithmeticException</w:t>
+      </w:r>
+      <w:proofErr w:type="spellEnd"/>
+      <w:r>
+        <w:t xml:space="preserve"> ex) {</w:t>
+      </w:r>
+    </w:p>
+    <w:p>
+      <w:pPr>
+        <w:pStyle w:val="NoSpacing"/>
+      </w:pPr>
+      <w:r>
+        <w:t xml:space="preserve">            </w:t>
+      </w:r>
+      <w:proofErr w:type="spellStart"/>
+      <w:r>
+        <w:t>JOptionPane.showMessageDialog</w:t>
+      </w:r>
+      <w:proofErr w:type="spellEnd"/>
+      <w:r>
+        <w:t>(</w:t>
+      </w:r>
+    </w:p>
+    <w:p>
+      <w:pPr>
+        <w:pStyle w:val="NoSpacing"/>
+      </w:pPr>
+      <w:r>
+        <w:t>                frame,</w:t>
+      </w:r>
+    </w:p>
+    <w:p>
+      <w:pPr>
+        <w:pStyle w:val="NoSpacing"/>
+      </w:pPr>
+      <w:r>
+        <w:t xml:space="preserve">                </w:t>
+      </w:r>
+      <w:proofErr w:type="spellStart"/>
+      <w:proofErr w:type="gramStart"/>
+      <w:r>
+        <w:t>ex.getMessage</w:t>
+      </w:r>
+      <w:proofErr w:type="spellEnd"/>
+      <w:proofErr w:type="gramEnd"/>
+      <w:r>
+        <w:t>(),</w:t>
+      </w:r>
+    </w:p>
+    <w:p>
+      <w:pPr>
+        <w:pStyle w:val="NoSpacing"/>
+      </w:pPr>
+      <w:r>
+        <w:t>                "Arithmetic Error",</w:t>
+      </w:r>
+    </w:p>
+    <w:p>
+      <w:pPr>
+        <w:pStyle w:val="NoSpacing"/>
+      </w:pPr>
+      <w:r>
+        <w:t xml:space="preserve">                </w:t>
+      </w:r>
+      <w:proofErr w:type="spellStart"/>
+      <w:r>
+        <w:t>JOptionPane.ERROR_MESSAGE</w:t>
+      </w:r>
+      <w:proofErr w:type="spellEnd"/>
+    </w:p>
+    <w:p>
+      <w:pPr>
+        <w:pStyle w:val="NoSpacing"/>
+      </w:pPr>
+      <w:r>
+        <w:t>            );</w:t>
+      </w:r>
+    </w:p>
+    <w:p>
+      <w:pPr>
+        <w:pStyle w:val="NoSpacing"/>
+      </w:pPr>
+      <w:r>
+        <w:t xml:space="preserve">            </w:t>
+      </w:r>
+      <w:proofErr w:type="spellStart"/>
+      <w:proofErr w:type="gramStart"/>
+      <w:r>
+        <w:t>display.setText</w:t>
+      </w:r>
+      <w:proofErr w:type="spellEnd"/>
+      <w:proofErr w:type="gramEnd"/>
+      <w:r>
+        <w:t>("");</w:t>
+      </w:r>
+    </w:p>
+    <w:p>
+      <w:pPr>
+        <w:pStyle w:val="NoSpacing"/>
+      </w:pPr>
+      <w:r>
+        <w:t>            return;</w:t>
+      </w:r>
+    </w:p>
+    <w:p>
+      <w:pPr>
+        <w:pStyle w:val="NoSpacing"/>
+      </w:pPr>
+    </w:p>
+    <w:p>
+      <w:pPr>
+        <w:pStyle w:val="NoSpacing"/>
+      </w:pPr>
+      <w:r>
+        <w:t>        } catch (</w:t>
+      </w:r>
+      <w:proofErr w:type="spellStart"/>
+      <w:r>
+        <w:t>NumberFormatException</w:t>
+      </w:r>
+      <w:proofErr w:type="spellEnd"/>
+      <w:r>
+        <w:t xml:space="preserve"> ex) {</w:t>
+      </w:r>
+    </w:p>
+    <w:p>
+      <w:pPr>
+        <w:pStyle w:val="NoSpacing"/>
+      </w:pPr>
+      <w:r>
+        <w:t xml:space="preserve">            </w:t>
+      </w:r>
+      <w:proofErr w:type="spellStart"/>
+      <w:r>
+        <w:t>JOptionPane.showMessageDialog</w:t>
+      </w:r>
+      <w:proofErr w:type="spellEnd"/>
+      <w:r>
+        <w:t>(</w:t>
+      </w:r>
+    </w:p>
+    <w:p>
+      <w:pPr>
+        <w:pStyle w:val="NoSpacing"/>
+      </w:pPr>
+      <w:r>
+        <w:t>                frame,</w:t>
+      </w:r>
+    </w:p>
+    <w:p>
+      <w:pPr>
+        <w:pStyle w:val="NoSpacing"/>
+      </w:pPr>
+      <w:r>
+        <w:t xml:space="preserve">                </w:t>
+      </w:r>
+      <w:proofErr w:type="spellStart"/>
+      <w:proofErr w:type="gramStart"/>
+      <w:r>
+        <w:t>ex.getMessage</w:t>
+      </w:r>
+      <w:proofErr w:type="spellEnd"/>
+      <w:proofErr w:type="gramEnd"/>
+      <w:r>
+        <w:t>(),</w:t>
+      </w:r>
+    </w:p>
+    <w:p>
+      <w:pPr>
+        <w:pStyle w:val="NoSpacing"/>
+      </w:pPr>
+      <w:r>
+        <w:t>                "Input Error",</w:t>
+      </w:r>
+    </w:p>
+    <w:p>
+      <w:pPr>
+        <w:pStyle w:val="NoSpacing"/>
+      </w:pPr>
+      <w:r>
+        <w:t xml:space="preserve">                </w:t>
+      </w:r>
+      <w:proofErr w:type="spellStart"/>
+      <w:r>
+        <w:t>JOptionPane.ERROR_MESSAGE</w:t>
+      </w:r>
+      <w:proofErr w:type="spellEnd"/>
+    </w:p>
+    <w:p>
+      <w:pPr>
+        <w:pStyle w:val="NoSpacing"/>
+      </w:pPr>
+      <w:r>
+        <w:t>            );</w:t>
+      </w:r>
+    </w:p>
+    <w:p>
+      <w:pPr>
+        <w:pStyle w:val="NoSpacing"/>
+      </w:pPr>
+      <w:r>
+        <w:t>            return;</w:t>
+      </w:r>
+    </w:p>
+    <w:p>
+      <w:pPr>
+        <w:pStyle w:val="NoSpacing"/>
+      </w:pPr>
+      <w:r>
+        <w:t>        }</w:t>
+      </w:r>
+    </w:p>
+    <w:p>
+      <w:pPr>
+        <w:pStyle w:val="NoSpacing"/>
+      </w:pPr>
+      <w:r>
+        <w:t>    }</w:t>
+      </w:r>
+    </w:p>
+    <w:p>
+      <w:pPr>
+        <w:pStyle w:val="NoSpacing"/>
+      </w:pPr>
+    </w:p>
+    <w:p>
+      <w:pPr>
+        <w:pStyle w:val="NoSpacing"/>
+      </w:pPr>
+    </w:p>
+    <w:p>
+      <w:pPr>
+        <w:pStyle w:val="NoSpacing"/>
+      </w:pPr>
+      <w:r>
+        <w:t xml:space="preserve">    public static void </w:t>
+      </w:r>
+      <w:proofErr w:type="gramStart"/>
+      <w:r>
+        <w:t>main(String[</w:t>
+      </w:r>
+      <w:proofErr w:type="gramEnd"/>
+      <w:r>
+        <w:t xml:space="preserve">] </w:t>
+      </w:r>
+      <w:proofErr w:type="spellStart"/>
+      <w:r>
+        <w:t>args</w:t>
+      </w:r>
+      <w:proofErr w:type="spellEnd"/>
+      <w:r>
+        <w:t>) {</w:t>
+      </w:r>
+    </w:p>
+    <w:p>
+      <w:pPr>
+        <w:pStyle w:val="NoSpacing"/>
+      </w:pPr>
+      <w:r>
+        <w:t xml:space="preserve">        new </w:t>
+      </w:r>
+      <w:proofErr w:type="gramStart"/>
+      <w:r>
+        <w:t>Calculator(</w:t>
+      </w:r>
+      <w:proofErr w:type="gramEnd"/>
+      <w:r>
+        <w:t>);</w:t>
+      </w:r>
+    </w:p>
+    <w:p>
+      <w:pPr>
+        <w:pStyle w:val="NoSpacing"/>
+      </w:pPr>
+      <w:r>
+        <w:t>    }</w:t>
+      </w:r>
+    </w:p>
+    <w:p>
+      <w:pPr>
+        <w:pStyle w:val="NoSpacing"/>
+      </w:pPr>
+      <w:r>
+        <w:t>}</w:t>
+      </w:r>
+    </w:p>
+    <w:p>
+      <w:pPr>
+        <w:pStyle w:val="NoSpacing"/>
+      </w:pPr>
+    </w:p>
+    <w:p>
+      <w:pPr>
+        <w:pStyle w:val="NoSpacing"/>
+      </w:pPr>
+    </w:p>
+    <w:p>
+      <w:pPr>
+        <w:pStyle w:val="NoSpacing"/>
+      </w:pPr>
+    </w:p>
+    <w:p>
+      <w:pPr>
+        <w:pStyle w:val="NoSpacing"/>
+        <w:pBdr>
+          <w:bottom w:val="single" w:sz="6" w:space="1" w:color="auto"/>
+        </w:pBdr>
+      </w:pPr>
+    </w:p>
+    <w:p>
+      <w:pPr>
+        <w:pStyle w:val="NoSpacing"/>
+        <w:rPr>
+          <w:b/>
+          <w:bCs/>
+        </w:rPr>
+      </w:pPr>
+      <w:r>
+        <w:rPr>
+          <w:b/>
+          <w:bCs/>
+        </w:rPr>
+        <w:t>OUTPUT:</w:t>
+      </w:r>
+    </w:p>
+    <w:p>
+      <w:pPr>
+        <w:pStyle w:val="NoSpacing"/>
+        <w:jc w:val="center"/>
+        <w:rPr>
+          <w:b/>
+          <w:bCs/>
+        </w:rPr>
+      </w:pPr>
+      <w:r>
+        <w:rPr>
+          <w:b/>
+          <w:bCs/>
+        </w:rPr>
+        <w:drawing>
+          <wp:anchor distT="0" distB="0" distL="114300" distR="114300" simplePos="0" relativeHeight="251672576" behindDoc="0" locked="0" layoutInCell="1" allowOverlap="1" wp14:anchorId="375B46C2" wp14:editId="1B5493A0">
+            <wp:simplePos x="0" y="0"/>
+            <wp:positionH relativeFrom="column">
+              <wp:posOffset>2849880</wp:posOffset>
+            </wp:positionH>
+            <wp:positionV relativeFrom="page">
+              <wp:posOffset>1325880</wp:posOffset>
+            </wp:positionV>
+            <wp:extent cx="2176145" cy="2194560"/>
+            <wp:effectExtent l="19050" t="19050" r="14605" b="15240"/>
+            <wp:wrapNone/>
+            <wp:docPr id="1480836772" name="Picture 1"/>
+            <wp:cNvGraphicFramePr>
+              <a:graphicFrameLocks xmlns:a="http://schemas.openxmlformats.org/drawingml/2006/main" noChangeAspect="1"/>
+            </wp:cNvGraphicFramePr>
+            <a:graphic xmlns:a="http://schemas.openxmlformats.org/drawingml/2006/main">
+              <a:graphicData uri="http://schemas.openxmlformats.org/drawingml/2006/picture">
+                <pic:pic xmlns:pic="http://schemas.openxmlformats.org/drawingml/2006/picture">
+                  <pic:nvPicPr>
+                    <pic:cNvPr id="1480836772" name=""/>
+                    <pic:cNvPicPr/>
+                  </pic:nvPicPr>
+                  <pic:blipFill>
+                    <a:blip r:embed="rId11">
+                      <a:extLst>
+                        <a:ext uri="{28A0092B-C50C-407E-A947-70E740481C1C}">
+                          <a14:useLocalDpi xmlns:a14="http://schemas.microsoft.com/office/drawing/2010/main" val="0"/>
+                        </a:ext>
+                      </a:extLst>
+                    </a:blip>
+                    <a:stretch>
+                      <a:fillRect/>
+                    </a:stretch>
+                  </pic:blipFill>
+                  <pic:spPr>
+                    <a:xfrm>
+                      <a:off x="0" y="0"/>
+                      <a:ext cx="2176145" cy="2194560"/>
+                    </a:xfrm>
+                    <a:prstGeom prst="rect">
+                      <a:avLst/>
+                    </a:prstGeom>
+                    <a:ln>
+                      <a:solidFill>
+                        <a:schemeClr val="tx1"/>
+                      </a:solidFill>
+                    </a:ln>
+                  </pic:spPr>
+                </pic:pic>
+              </a:graphicData>
+            </a:graphic>
+          </wp:anchor>
+        </w:drawing>
+      </w:r>
+      <w:r>
+        <w:rPr>
+          <w:b/>
+          <w:bCs/>
+        </w:rPr>
+        <w:drawing>
+          <wp:anchor distT="0" distB="0" distL="114300" distR="114300" simplePos="0" relativeHeight="251671552" behindDoc="0" locked="0" layoutInCell="1" allowOverlap="1" wp14:anchorId="07C486E8" wp14:editId="72E73218">
+            <wp:simplePos x="0" y="0"/>
+            <wp:positionH relativeFrom="column">
+              <wp:posOffset>670560</wp:posOffset>
+            </wp:positionH>
+            <wp:positionV relativeFrom="page">
+              <wp:posOffset>1333500</wp:posOffset>
+            </wp:positionV>
+            <wp:extent cx="2141220" cy="2167890"/>
+            <wp:effectExtent l="19050" t="19050" r="11430" b="22860"/>
+            <wp:wrapNone/>
+            <wp:docPr id="673525472" name="Picture 1"/>
+            <wp:cNvGraphicFramePr>
+              <a:graphicFrameLocks xmlns:a="http://schemas.openxmlformats.org/drawingml/2006/main" noChangeAspect="1"/>
+            </wp:cNvGraphicFramePr>
+            <a:graphic xmlns:a="http://schemas.openxmlformats.org/drawingml/2006/main">
+              <a:graphicData uri="http://schemas.openxmlformats.org/drawingml/2006/picture">
+                <pic:pic xmlns:pic="http://schemas.openxmlformats.org/drawingml/2006/picture">
+                  <pic:nvPicPr>
+                    <pic:cNvPr id="673525472" name=""/>
+                    <pic:cNvPicPr/>
+                  </pic:nvPicPr>
+                  <pic:blipFill>
+                    <a:blip r:embed="rId12">
+                      <a:extLst>
+                        <a:ext uri="{28A0092B-C50C-407E-A947-70E740481C1C}">
+                          <a14:useLocalDpi xmlns:a14="http://schemas.microsoft.com/office/drawing/2010/main" val="0"/>
+                        </a:ext>
+                      </a:extLst>
+                    </a:blip>
+                    <a:stretch>
+                      <a:fillRect/>
+                    </a:stretch>
+                  </pic:blipFill>
+                  <pic:spPr>
+                    <a:xfrm>
+                      <a:off x="0" y="0"/>
+                      <a:ext cx="2141220" cy="2167890"/>
+                    </a:xfrm>
+                    <a:prstGeom prst="rect">
+                      <a:avLst/>
+                    </a:prstGeom>
+                    <a:ln>
+                      <a:solidFill>
+                        <a:schemeClr val="tx1"/>
+                      </a:solidFill>
+                    </a:ln>
+                  </pic:spPr>
+                </pic:pic>
+              </a:graphicData>
+            </a:graphic>
+          </wp:anchor>
+        </w:drawing>
+      </w:r>
+      <w:r>
+        <w:rPr>
+          <w:b/>
+          <w:bCs/>
+        </w:rPr>
+        <w:t>0</w:t>
+      </w:r>
+    </w:p>
+    <w:p>
+      <w:pPr>
+        <w:pStyle w:val="NoSpacing"/>
+        <w:jc w:val="center"/>
+        <w:rPr>
+          <w:b/>
+          <w:bCs/>
+        </w:rPr>
+      </w:pPr>
+    </w:p>
+    <w:p>
+      <w:pPr>
+        <w:pStyle w:val="NoSpacing"/>
+        <w:rPr>
+          <w:b/>
+          <w:bCs/>
+        </w:rPr>
+      </w:pPr>
+    </w:p>
+    <w:p>
+      <w:pPr>
+        <w:pStyle w:val="NoSpacing"/>
+        <w:rPr>
+          <w:b/>
+          <w:bCs/>
+        </w:rPr>
+      </w:pPr>
+    </w:p>
+    <w:p>
+      <w:pPr>
+        <w:pStyle w:val="NoSpacing"/>
+        <w:rPr>
+          <w:b/>
+          <w:bCs/>
+        </w:rPr>
+      </w:pPr>
+    </w:p>
+    <w:p>
+      <w:pPr>
+        <w:pStyle w:val="NoSpacing"/>
+        <w:rPr>
+          <w:b/>
+          <w:bCs/>
+        </w:rPr>
+      </w:pPr>
+    </w:p>
+    <w:p>
+      <w:pPr>
+        <w:pStyle w:val="NoSpacing"/>
+        <w:rPr>
+          <w:b/>
+          <w:bCs/>
+        </w:rPr>
+      </w:pPr>
+    </w:p>
+    <w:p>
+      <w:pPr>
+        <w:pStyle w:val="NoSpacing"/>
+        <w:rPr>
+          <w:b/>
+          <w:bCs/>
+        </w:rPr>
+      </w:pPr>
+    </w:p>
+    <w:p>
+      <w:pPr>
+        <w:pStyle w:val="NoSpacing"/>
+        <w:rPr>
+          <w:b/>
+          <w:bCs/>
+        </w:rPr>
+      </w:pPr>
+    </w:p>
+    <w:p>
+      <w:pPr>
+        <w:pStyle w:val="NoSpacing"/>
+        <w:rPr>
+          <w:b/>
+          <w:bCs/>
+        </w:rPr>
+      </w:pPr>
+    </w:p>
+    <w:p>
+      <w:pPr>
+        <w:pStyle w:val="NoSpacing"/>
+        <w:rPr>
+          <w:b/>
+          <w:bCs/>
+        </w:rPr>
+      </w:pPr>
+    </w:p>
+    <w:p>
+      <w:pPr>
+        <w:pStyle w:val="NoSpacing"/>
+        <w:rPr>
+          <w:b/>
+          <w:bCs/>
+        </w:rPr>
+      </w:pPr>
+    </w:p>
+    <w:p>
+      <w:pPr>
+        <w:pStyle w:val="NoSpacing"/>
+        <w:rPr>
+          <w:b/>
+          <w:bCs/>
+        </w:rPr>
+      </w:pPr>
+    </w:p>
+    <w:p>
+      <w:pPr>
+        <w:pStyle w:val="NoSpacing"/>
+        <w:jc w:val="center"/>
+        <w:rPr>
+          <w:b/>
+          <w:bCs/>
+        </w:rPr>
+      </w:pPr>
+      <w:r>
+        <w:rPr>
+          <w:noProof/>
+        </w:rPr>
+        <mc:AlternateContent>
+          <mc:Choice Requires="wps">
+            <w:drawing>
+              <wp:anchor distT="0" distB="0" distL="114300" distR="114300" simplePos="0" relativeHeight="251675648" behindDoc="0" locked="0" layoutInCell="1" allowOverlap="1" wp14:anchorId="773CDF60" wp14:editId="0E2394D5">
+                <wp:simplePos x="0" y="0"/>
+                <wp:positionH relativeFrom="column">
+                  <wp:posOffset>1638300</wp:posOffset>
+                </wp:positionH>
+                <wp:positionV relativeFrom="page">
+                  <wp:posOffset>6118860</wp:posOffset>
+                </wp:positionV>
+                <wp:extent cx="2461260" cy="258445"/>
+                <wp:effectExtent l="0" t="0" r="15240" b="8255"/>
+                <wp:wrapNone/>
+                <wp:docPr id="1167844179" name="Text Box 1"/>
+                <wp:cNvGraphicFramePr/>
+                <a:graphic xmlns:a="http://schemas.openxmlformats.org/drawingml/2006/main">
+                  <a:graphicData uri="http://schemas.microsoft.com/office/word/2010/wordprocessingShape">
+                    <wps:wsp>
+                      <wps:cNvSpPr txBox="1"/>
+                      <wps:spPr>
+                        <a:xfrm>
+                          <a:off x="0" y="0"/>
+                          <a:ext cx="2461260" cy="258445"/>
+                        </a:xfrm>
+                        <a:prstGeom prst="rect">
+                          <a:avLst/>
+                        </a:prstGeom>
+                        <a:noFill/>
+                        <a:ln>
+                          <a:noFill/>
+                        </a:ln>
+                      </wps:spPr>
+                      <wps:txbx>
+                        <w:txbxContent>
+                          <w:p>
+                            <w:pPr>
+                              <w:pStyle w:val="Caption"/>
+                              <w:jc w:val="center"/>
+                              <w:rPr>
+                                <w:b/>
+                                <w:bCs/>
+                              </w:rPr>
+                            </w:pPr>
+                            <w:r>
+                              <w:t xml:space="preserve">Figure </w:t>
+                            </w:r>
+                            <w:r>
+                              <w:fldChar w:fldCharType="begin"/>
+                            </w:r>
+                            <w:r>
+                              <w:instrText xml:space="preserve"> SEQ Figure \* ARABIC </w:instrText>
+                            </w:r>
+                            <w:r>
+                              <w:fldChar w:fldCharType="separate"/>
+                            </w:r>
+                            <w:r>
+                              <w:rPr>
+                                <w:noProof/>
+                              </w:rPr>
+                              <w:t>5</w:t>
+                            </w:r>
+                            <w:r>
+                              <w:fldChar w:fldCharType="end"/>
+                            </w:r>
+                            <w:r>
+                              <w:t>: Output of program 5</w:t>
+                            </w:r>
+                          </w:p>
+                        </w:txbxContent>
+                      </wps:txbx>
+                      <wps:bodyPr rot="0" spcFirstLastPara="0" vertOverflow="overflow" horzOverflow="overflow" vert="horz" wrap="square" lIns="0" tIns="0" rIns="0" bIns="0" numCol="1" spcCol="0" rtlCol="0" fromWordArt="0" anchor="t" anchorCtr="0" forceAA="0" compatLnSpc="1">
+                        <a:prstTxWarp prst="textNoShape">
+                          <a:avLst/>
+                        </a:prstTxWarp>
+                        <a:spAutoFit/>
+                      </wps:bodyPr>
+                    </wps:wsp>
+                  </a:graphicData>
+                </a:graphic>
+              </wp:anchor>
+            </w:drawing>
+          </mc:Choice>
+          <mc:Fallback>
+            <w:pict>
+              <v:shape w14:anchorId="773CDF60" id="_x0000_s1030" type="#_x0000_t202" style="position:absolute;left:0;text-align:left;margin-left:129pt;margin-top:481.8pt;width:193.8pt;height:20.35pt;z-index:251675648;visibility:visible;mso-wrap-style:square;mso-wrap-distance-left:9pt;mso-wrap-distance-top:0;mso-wrap-distance-right:9pt;mso-wrap-distance-bottom:0;mso-position-horizontal:absolute;mso-position-horizontal-relative:text;mso-position-vertical:absolute;mso-position-vertical-relative:page;v-text-anchor:top" o:gfxdata="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" filled="f" stroked="f">
+                <v:textbox style="mso-fit-shape-to-text:t" inset="0,0,0,0">
+                  <w:txbxContent>
+                    <w:p>
+                      <w:pPr>
+                        <w:pStyle w:val="Caption"/>
+                        <w:jc w:val="center"/>
+                        <w:rPr>
+                          <w:b/>
+                          <w:bCs/>
+                        </w:rPr>
+                      </w:pPr>
+                      <w:r>
+                        <w:t xml:space="preserve">Figure </w:t>
+                      </w:r>
+                      <w:r>
+                        <w:fldChar w:fldCharType="begin"/>
+                      </w:r>
+                      <w:r>
+                        <w:instrText xml:space="preserve"> SEQ Figure \* ARABIC </w:instrText>
+                      </w:r>
+                      <w:r>
+                        <w:fldChar w:fldCharType="separate"/>
+                      </w:r>
+                      <w:r>
+                        <w:rPr>
+                          <w:noProof/>
+                        </w:rPr>
+                        <w:t>5</w:t>
+                      </w:r>
+                      <w:r>
+                        <w:fldChar w:fldCharType="end"/>
+                      </w:r>
+                      <w:r>
+                        <w:t>: Output of program 5</w:t>
+                      </w:r>
+                    </w:p>
+                  </w:txbxContent>
+                </v:textbox>
+                <w10:wrap anchory="page"/>
+              </v:shape>
+            </w:pict>
+          </mc:Fallback>
+        </mc:AlternateContent>
+      </w:r>
+      <w:r>
+        <w:rPr>
+          <w:b/>
+          <w:bCs/>
+        </w:rPr>
+        <w:drawing>
+          <wp:anchor distT="0" distB="0" distL="114300" distR="114300" simplePos="0" relativeHeight="251673600" behindDoc="0" locked="0" layoutInCell="1" allowOverlap="1" wp14:anchorId="3432661F" wp14:editId="7ECDAA30">
+            <wp:simplePos x="0" y="0"/>
+            <wp:positionH relativeFrom="column">
+              <wp:posOffset>1638300</wp:posOffset>
+            </wp:positionH>
+            <wp:positionV relativeFrom="page">
+              <wp:posOffset>3566160</wp:posOffset>
+            </wp:positionV>
+            <wp:extent cx="2461260" cy="2497455"/>
+            <wp:effectExtent l="19050" t="19050" r="15240" b="17145"/>
+            <wp:wrapNone/>
+            <wp:docPr id="1539611883" name="Picture 1"/>
+            <wp:cNvGraphicFramePr>
+              <a:graphicFrameLocks xmlns:a="http://schemas.openxmlformats.org/drawingml/2006/main" noChangeAspect="1"/>
+            </wp:cNvGraphicFramePr>
+            <a:graphic xmlns:a="http://schemas.openxmlformats.org/drawingml/2006/main">
+              <a:graphicData uri="http://schemas.openxmlformats.org/drawingml/2006/picture">
+                <pic:pic xmlns:pic="http://schemas.openxmlformats.org/drawingml/2006/picture">
+                  <pic:nvPicPr>
+                    <pic:cNvPr id="1539611883" name=""/>
+                    <pic:cNvPicPr/>
+                  </pic:nvPicPr>
+                  <pic:blipFill>
+                    <a:blip r:embed="rId13">
+                      <a:extLst>
+                        <a:ext uri="{28A0092B-C50C-407E-A947-70E740481C1C}">
+                          <a14:useLocalDpi xmlns:a14="http://schemas.microsoft.com/office/drawing/2010/main" val="0"/>
+                        </a:ext>
+                      </a:extLst>
+                    </a:blip>
+                    <a:stretch>
+                      <a:fillRect/>
+                    </a:stretch>
+                  </pic:blipFill>
+                  <pic:spPr>
+                    <a:xfrm>
+                      <a:off x="0" y="0"/>
+                      <a:ext cx="2461260" cy="2497455"/>
+                    </a:xfrm>
+                    <a:prstGeom prst="rect">
+                      <a:avLst/>
+                    </a:prstGeom>
+                    <a:ln>
+                      <a:solidFill>
+                        <a:schemeClr val="tx1"/>
+                      </a:solidFill>
+                    </a:ln>
+                  </pic:spPr>
+                </pic:pic>
+              </a:graphicData>
+            </a:graphic>
+          </wp:anchor>
+        </w:drawing>
+      </w:r>
+    </w:p>
+    <w:p>
+      <w:pPr>
+        <w:pStyle w:val="NoSpacing"/>
+        <w:rPr>
+          <w:b/>
+          <w:bCs/>
+        </w:rPr>
+      </w:pPr>
+    </w:p>
+    <w:p>
+      <w:pPr>
+        <w:pStyle w:val="NoSpacing"/>
+        <w:rPr>
+          <w:b/>
+          <w:bCs/>
+        </w:rPr>
+      </w:pPr>
+    </w:p>
+    <w:p>
+      <w:pPr>
+        <w:pStyle w:val="NoSpacing"/>
+        <w:rPr>
+          <w:b/>
+          <w:bCs/>
+        </w:rPr>
+      </w:pPr>
+    </w:p>
+    <w:p>
+      <w:pPr>
+        <w:pStyle w:val="NoSpacing"/>
+        <w:rPr>
+          <w:b/>
+          <w:bCs/>
+        </w:rPr>
+      </w:pPr>
+    </w:p>
+    <w:p>
+      <w:pPr>
+        <w:pStyle w:val="NoSpacing"/>
+        <w:rPr>
+          <w:b/>
+          <w:bCs/>
+        </w:rPr>
+      </w:pPr>
+    </w:p>
+    <w:p>
+      <w:pPr>
+        <w:pStyle w:val="NoSpacing"/>
+        <w:rPr>
+          <w:b/>
+          <w:bCs/>
+        </w:rPr>
+      </w:pPr>
+    </w:p>
+    <w:p>
+      <w:pPr>
+        <w:pStyle w:val="NoSpacing"/>
+        <w:rPr>
+          <w:b/>
+          <w:bCs/>
+        </w:rPr>
+      </w:pPr>
+    </w:p>
+    <w:p>
+      <w:pPr>
+        <w:pStyle w:val="NoSpacing"/>
+        <w:rPr>
+          <w:b/>
+          <w:bCs/>
+        </w:rPr>
+      </w:pPr>
+    </w:p>
+    <w:p>
+      <w:pPr>
+        <w:pStyle w:val="NoSpacing"/>
+        <w:rPr>
+          <w:b/>
+          <w:bCs/>
+        </w:rPr>
+      </w:pPr>
+    </w:p>
+    <w:p>
+      <w:pPr>
+        <w:pStyle w:val="NoSpacing"/>
+        <w:rPr>
+          <w:b/>
+          <w:bCs/>
+        </w:rPr>
+      </w:pPr>
+    </w:p>
+    <w:p>
+      <w:pPr>
+        <w:pStyle w:val="NoSpacing"/>
+        <w:rPr>
+          <w:b/>
+          <w:bCs/>
+        </w:rPr>
+      </w:pPr>
+    </w:p>
+    <w:p>
+      <w:pPr>
+        <w:pStyle w:val="NoSpacing"/>
+        <w:rPr>
+          <w:b/>
+          <w:bCs/>
+        </w:rPr>
+      </w:pPr>
+    </w:p>
+    <w:p>
+      <w:pPr>
+        <w:pStyle w:val="NoSpacing"/>
+        <w:rPr>
+          <w:b/>
+          <w:bCs/>
+        </w:rPr>
+      </w:pPr>
+    </w:p>
+    <w:p>
+      <w:pPr>
+        <w:pStyle w:val="NoSpacing"/>
+        <w:rPr>
+          <w:b/>
+          <w:bCs/>
+        </w:rPr>
+      </w:pPr>
+    </w:p>
+    <w:p>
+      <w:pPr>
+        <w:pStyle w:val="NoSpacing"/>
+        <w:rPr>
+          <w:b/>
+          <w:bCs/>
+        </w:rPr>
+      </w:pPr>
+    </w:p>
+    <w:p>
+      <w:pPr>
+        <w:pStyle w:val="NoSpacing"/>
+        <w:rPr>
+          <w:b/>
+          <w:bCs/>
+        </w:rPr>
+      </w:pPr>
+    </w:p>
+    <w:p>
+      <w:pPr>
+        <w:pStyle w:val="NoSpacing"/>
+        <w:rPr>
+          <w:b/>
+          <w:bCs/>
+        </w:rPr>
+      </w:pPr>
+    </w:p>
+    <w:p>
+      <w:pPr>
+        <w:pStyle w:val="NoSpacing"/>
+        <w:rPr>
+          <w:b/>
+          <w:bCs/>
+        </w:rPr>
+      </w:pPr>
+    </w:p>
+    <w:p>
+      <w:pPr>
+        <w:pStyle w:val="NoSpacing"/>
+        <w:rPr>
+          <w:b/>
+          <w:bCs/>
+        </w:rPr>
+      </w:pPr>
+    </w:p>
+    <w:p>
+      <w:pPr>
+        <w:pStyle w:val="NoSpacing"/>
+        <w:rPr>
+          <w:b/>
+          <w:bCs/>
+        </w:rPr>
+      </w:pPr>
+    </w:p>
+    <w:p>
+      <w:pPr>
+        <w:pStyle w:val="NoSpacing"/>
+        <w:rPr>
+          <w:b/>
+          <w:bCs/>
+        </w:rPr>
+      </w:pPr>
+    </w:p>
+    <w:p>
+      <w:pPr>
+        <w:jc w:val="left"/>
+        <w:rPr>
+          <w:b/>
+          <w:bCs/>
+        </w:rPr>
+      </w:pPr>
+      <w:r>
+        <w:rPr>
+          <w:b/>
+          <w:bCs/>
+        </w:rPr>
+        <w:br w:type="page"/>
+      </w:r>
+    </w:p>
+    <w:p>
+      <w:pPr>
+        <w:pStyle w:val="Heading1"/>
+      </w:pPr>
+      <w:r>
+        <w:lastRenderedPageBreak/>
+        <w:t>EXPERIMENT – 6</w:t>
+      </w:r>
+    </w:p>
+    <w:p>
+      <w:pPr>
+        <w:pStyle w:val="Heading2"/>
+        <w:rPr>
+          <w:lang w:val="en-US"/>
+        </w:rPr>
+      </w:pPr>
+      <w:r>
+        <w:rPr>
+          <w:lang w:val="en-US"/>
+        </w:rPr>
+        <w:t>6.</w:t>
+      </w:r>
+      <w:r>
+        <w:rPr>
+          <w:lang w:val="en-US"/>
+        </w:rPr>
+        <w:t xml:space="preserve"> </w:t>
+      </w:r>
+      <w:r>
+        <w:t>Write a Java program that creates a user interface to perform integer divisions. The user enters two numbers in the text fields, Num1 and Num2. The division of Num1 and Num 2 is displayed in the Result field when the Divide button is clicked. If Num1 or Num2 were not an integer, the program would throw a Number Format Exception. If Num2 were Zero, the program would throw an Arithmetic Exception. Display the exception in a message dialog box.</w:t>
+      </w:r>
+      <w:r>
+        <w:rPr>
+          <w:lang w:val="en-US"/>
+        </w:rPr>
+        <w:t xml:space="preserve"> </w:t>
+      </w:r>
+    </w:p>
     <w:sectPr>
-      <w:headerReference w:type="default" r:id="rId11"/>
-      <w:footerReference w:type="default" r:id="rId12"/>
+      <w:headerReference w:type="default" r:id="rId14"/>
+      <w:footerReference w:type="default" r:id="rId15"/>
       <w:pgSz w:w="11906" w:h="16838"/>
       <w:pgMar w:top="1440" w:right="1440" w:bottom="1440" w:left="1440" w:header="709" w:footer="709" w:gutter="0"/>
       <w:cols w:space="708"/>
@@ -3477,6 +7086,7 @@
           <w:dataBinding w:prefixMappings="xmlns:ns0='http://purl.org/dc/elements/1.1/' xmlns:ns1='http://schemas.openxmlformats.org/package/2006/metadata/core-properties' " w:xpath="/ns1:coreProperties[1]/ns0:creator[1]" w:storeItemID="{6C3C8BC8-F283-45AE-878A-BAB7291924A1}"/>
           <w:text/>
         </w:sdtPr>
+        <w:sdtEndPr/>
         <w:sdtContent>
           <w:tc>
             <w:tcPr>
@@ -4704,6 +8314,7 @@
   <w:rsids>
     <w:rsidRoot w:val="00BD12AF"/>
     <w:rsid w:val="00243566"/>
+    <w:rsid w:val="002A1A7B"/>
     <w:rsid w:val="003E734A"/>
     <w:rsid w:val="00435E9F"/>
     <w:rsid w:val="0047577A"/>
@@ -4712,6 +8323,7 @@
     <w:rsid w:val="00BD12AF"/>
     <w:rsid w:val="00D25325"/>
     <w:rsid w:val="00D42981"/>
+    <w:rsid w:val="00E80EAF"/>
     <w:rsid w:val="00EA5366"/>
   </w:rsids>
   <m:mathPr>

</xml_diff>